<commit_message>
Fix Nichol citation (LEXIS unverifiable; "pro se" framing wrong)
Two issues with the original Nichol cite:
1. The LEXIS number 169901 cannot be confirmed via public sources.
2. The original parenthetical described Nichol as a "pro se litigant" — but
   Nichol had counsel; Umenhofer was the non-attorney who prepared materials
   for her. Per Studicata's case summary of the 2015 ruling.

Resolution: docket-only citation `No. 6:14-cv-01983-AA (D. Or. 2015)` with
corrected parenthetical that accurately describes the Rule 26(b)(3) extension
to non-attorney-prepared materials. Applied to fns 30 and 33.

All four Westlaw items now resolved (Heppner→Nobles, Shih→574, Carpenter
reframed, Nichol corrected). Word count: 4,930.

Rebuilt: .tex, .pdf (12 pages), .docx.

Co-Authored-By: Claude Sonnet 4.6 <noreply@anthropic.com>
</commit_message>
<xml_diff>
--- a/_paper/Slro_paper_final.docx
+++ b/_paper/Slro_paper_final.docx
@@ -2763,7 +2763,7 @@
         <w:t xml:space="preserve"> </w:t>
       </w:r>
       <w:r>
-        <w:t xml:space="preserve">Nichol v. City of Springfield, No. 6:14-cv-1983-AA, 2015 U.S. Dist. LEXIS 169901 (D. Or. Dec. 18, 2015) (extending work-product protection to materials prepared by a non-attorney friend assisting a pro se litigant in anticipation of litigation).</w:t>
+        <w:t xml:space="preserve">Nichol v. City of Springfield, No. 6:14-cv-01983-AA (D. Or. 2015) (extending work-product protection under Rule 26(b)(3) to materials prepared by a non-attorney for a party in anticipation of litigation).</w:t>
       </w:r>
     </w:p>
   </w:footnote>
@@ -2856,7 +2856,7 @@
         <w:t xml:space="preserve">Nichol</w:t>
       </w:r>
       <w:r>
-        <w:t xml:space="preserve">, 2015 U.S. Dist. LEXIS 169901 (same for non-attorney friend of pro se litigant).</w:t>
+        <w:t xml:space="preserve">, No. 6:14-cv-01983-AA (same for materials prepared by a non-attorney).</w:t>
       </w:r>
     </w:p>
   </w:footnote>

</xml_diff>

<commit_message>
Drop Nichol entirely; Carpenter + Shih cover the propositions
Nichol was always a stretch in fn 30 (which is about disclosure, not who can
prepare work product) and was redundant in fn 33 (Shih at 574 already
extends protection to non-attorney representatives). Combined with the
unverifiable LEXIS number and the incorrect "pro se" parenthetical, dropping
it produces a tighter, fully-verified citation set.

Final state:
- fn 30: Carpenter alone (Headnote 14 alignment)
- fn 33: Fed. R. Civ. P. 26(b)(3)(A) + Shih at 574

Word count: 4,889. All three outputs rebuilt.

Co-Authored-By: Claude Sonnet 4.6 <noreply@anthropic.com>
</commit_message>
<xml_diff>
--- a/_paper/Slro_paper_final.docx
+++ b/_paper/Slro_paper_final.docx
@@ -2747,23 +2747,7 @@
         <w:t xml:space="preserve"> </w:t>
       </w:r>
       <w:r>
-        <w:t xml:space="preserve">Carpenter v. United States, 138 S. Ct. 2206 (2018) (by analogy, holding that diminished privacy interests in information shared with a third party do not categorically defeat constitutional protection);</w:t>
-      </w:r>
-      <w:r>
-        <w:t xml:space="preserve"> </w:t>
-      </w:r>
-      <w:r>
-        <w:rPr>
-          <w:i/>
-          <w:iCs/>
-        </w:rPr>
-        <w:t xml:space="preserve">see also</w:t>
-      </w:r>
-      <w:r>
-        <w:t xml:space="preserve"> </w:t>
-      </w:r>
-      <w:r>
-        <w:t xml:space="preserve">Nichol v. City of Springfield, No. 6:14-cv-01983-AA (D. Or. 2015) (extending work-product protection under Rule 26(b)(3) to materials prepared by a non-attorney for a party in anticipation of litigation).</w:t>
+        <w:t xml:space="preserve">Carpenter v. United States, 138 S. Ct. 2206 (2018) (by analogy, holding that diminished privacy interests in information shared with a third party do not categorically defeat constitutional protection).</w:t>
       </w:r>
     </w:p>
   </w:footnote>
@@ -2843,20 +2827,7 @@
         <w:t xml:space="preserve">See also Shih</w:t>
       </w:r>
       <w:r>
-        <w:t xml:space="preserve">, 565 F. Supp. 3d at 574 (extending protection to a non-attorney representative);</w:t>
-      </w:r>
-      <w:r>
-        <w:t xml:space="preserve"> </w:t>
-      </w:r>
-      <w:r>
-        <w:rPr>
-          <w:i/>
-          <w:iCs/>
-        </w:rPr>
-        <w:t xml:space="preserve">Nichol</w:t>
-      </w:r>
-      <w:r>
-        <w:t xml:space="preserve">, No. 6:14-cv-01983-AA (same for materials prepared by a non-attorney).</w:t>
+        <w:t xml:space="preserve">, 565 F. Supp. 3d at 574 (extending protection to a non-attorney representative).</w:t>
       </w:r>
     </w:p>
   </w:footnote>

</xml_diff>

<commit_message>
Apply CoCounsel + DeepSeek combined edits (over budget; trim TBD)
Changes:
- fn 30: Carpenter pin (2219) + Riley v. California, 134 S. Ct. 2473, 2488 (2014) (originating source of "falls out of the picture entirely" language)
- Part I (intro): empty-field claim — civil rights AI scholarship and AI work-product scholarship are separate bodies; this Essay bridges them
- Part IV.A: Morgan direct quote elevated — "would further disadvantage unrepresented litigants"
- Part V: new counterargument paragraph addressing "AI lacks human mental impressions" critique
- New fn [^cnt]: Hickman, Nobles, Roberts v. Americable, Thaler v. Perlmutter
- AI Disclosure Form Q3 strengthened with originality finding

Word count: 5,146 (over 5,000 by 146). Trim path TBD with user.

Co-Authored-By: Claude Sonnet 4.6 <noreply@anthropic.com>
</commit_message>
<xml_diff>
--- a/_paper/Slro_paper_final.docx
+++ b/_paper/Slro_paper_final.docx
@@ -2,7 +2,7 @@
 <file path=word/document.xml><?xml version="1.0" encoding="utf-8"?>
 <w:document xmlns:w="http://schemas.openxmlformats.org/wordprocessingml/2006/main" xmlns:m="http://schemas.openxmlformats.org/officeDocument/2006/math" xmlns:r="http://schemas.openxmlformats.org/officeDocument/2006/relationships" xmlns:o="urn:schemas-microsoft-com:office:office" xmlns:v="urn:schemas-microsoft-com:vml" xmlns:w10="urn:schemas-microsoft-com:office:word" xmlns:a="http://schemas.openxmlformats.org/drawingml/2006/main" xmlns:pic="http://schemas.openxmlformats.org/drawingml/2006/picture" xmlns:wp="http://schemas.openxmlformats.org/drawingml/2006/wordprocessingDrawing">
   <w:body>
-    <w:bookmarkStart w:id="84" w:name="protected-legal-thought-in-the-age-of-ai"/>
+    <w:bookmarkStart w:id="85" w:name="protected-legal-thought-in-the-age-of-ai"/>
     <w:p>
       <w:pPr>
         <w:pStyle w:val="Heading1"/>
@@ -311,7 +311,7 @@
         <w:pStyle w:val="BodyText"/>
       </w:pPr>
       <w:r>
-        <w:t xml:space="preserve">The emerging divide is not about whether AI is reliable, whether its outputs are accurate, or whether its use constitutes the unauthorized practice of law. It is about whether the protection of legal preparation—the ability to research, analyze, and strategize without surrendering that work to the opposing side—attaches to the nature of the work or the status of the person performing it. This Essay argues that the fracture reveals a structural inequality in the distribution of protected legal thought, one that AI has made visible and that civil rights law is uniquely positioned to address. At its most extreme, this fracture leaves crime victims—who are not parties to the criminal proceeding, not represented by the prosecutor, and not entitled to appointed counsel—with no work-product framework for their preparation at all. The core thesis is that work-product protection is increasingly determined by professional credential and subscription tier rather than by function, and that this development conditions the exercise of fundamental rights on status and access.</w:t>
+        <w:t xml:space="preserve">The emerging divide is not about whether AI is reliable, whether its outputs are accurate, or whether its use constitutes the unauthorized practice of law. It is about whether the protection of legal preparation—the ability to research, analyze, and strategize without surrendering that work to the opposing side—attaches to the nature of the work or the status of the person performing it. This Essay enters an empty field. Existing scholarship treats AI as a civil rights threat in employment, housing, and criminal sentencing contexts, but has not yet examined how AI's role in legal preparation itself implicates equal protection, procedural fairness, and access to courts. This Essay argues that the fracture reveals a structural inequality in the distribution of protected legal thought, one that AI has made visible and that civil rights law is uniquely positioned to address. At its most extreme, this fracture leaves crime victims—who are not parties to the criminal proceeding, not represented by the prosecutor, and not entitled to appointed counsel—with no work-product framework for their preparation at all. The core thesis is that work-product protection is increasingly determined by professional credential and subscription tier rather than by function, and that this development conditions the exercise of fundamental rights on status and access.</w:t>
       </w:r>
     </w:p>
     <w:p>
@@ -715,7 +715,23 @@
         <w:pStyle w:val="BodyText"/>
       </w:pPr>
       <w:r>
-        <w:t xml:space="preserve">This produces a status-based distinction in the protection of legal preparation that implicates equal protection principles in ways courts have not yet confronted directly but cannot indefinitely avoid, particularly where the distinction systematically disadvantages those without access to counsel or protected channels of preparation.</w:t>
+        <w:t xml:space="preserve">This produces a status-based distinction in the protection of legal preparation that implicates equal protection principles in ways courts are only beginning to confront.</w:t>
+      </w:r>
+      <w:r>
+        <w:t xml:space="preserve"> </w:t>
+      </w:r>
+      <w:r>
+        <w:rPr>
+          <w:i/>
+          <w:iCs/>
+        </w:rPr>
+        <w:t xml:space="preserve">Morgan</w:t>
+      </w:r>
+      <w:r>
+        <w:t xml:space="preserve"> </w:t>
+      </w:r>
+      <w:r>
+        <w:t xml:space="preserve">itself recognized that conditioning AI work-product protection on attorney involvement "would further disadvantage unrepresented litigants"—the precise distributive consequence that civil rights scrutiny exists to address.</w:t>
       </w:r>
       <w:r>
         <w:rPr>
@@ -955,7 +971,7 @@
     </w:p>
     <w:bookmarkEnd w:id="65"/>
     <w:bookmarkEnd w:id="66"/>
-    <w:bookmarkStart w:id="75" w:name="X2e3abd68c33ba2037424b86b00463db66793c21"/>
+    <w:bookmarkStart w:id="76" w:name="X2e3abd68c33ba2037424b86b00463db66793c21"/>
     <w:p>
       <w:pPr>
         <w:pStyle w:val="Heading2"/>
@@ -1024,6 +1040,58 @@
         <w:pStyle w:val="BodyText"/>
       </w:pPr>
       <w:r>
+        <w:t xml:space="preserve">A deeper objection challenges the rule on doctrinal foundations: AI output, the argument runs, lacks the human mental impressions that</w:t>
+      </w:r>
+      <w:r>
+        <w:t xml:space="preserve"> </w:t>
+      </w:r>
+      <w:r>
+        <w:rPr>
+          <w:i/>
+          <w:iCs/>
+        </w:rPr>
+        <w:t xml:space="preserve">Hickman</w:t>
+      </w:r>
+      <w:r>
+        <w:t xml:space="preserve"> </w:t>
+      </w:r>
+      <w:r>
+        <w:t xml:space="preserve">and Rule 26(b)(3) exist to protect.</w:t>
+      </w:r>
+      <w:r>
+        <w:rPr>
+          <w:rStyle w:val="FootnoteReference"/>
+        </w:rPr>
+        <w:footnoteReference w:id="69"/>
+      </w:r>
+      <w:r>
+        <w:t xml:space="preserve"> </w:t>
+      </w:r>
+      <w:r>
+        <w:t xml:space="preserve">The objection is misplaced. The functional rule does not protect AI output as algorithmic product; it protects the human preparation activity—the prompts, the directional choices, the integration of output into a litigation strategy—that embeds the preparer's mental impressions as surely as a paralegal's research memorandum does. The copyright analogy under</w:t>
+      </w:r>
+      <w:r>
+        <w:t xml:space="preserve"> </w:t>
+      </w:r>
+      <w:r>
+        <w:rPr>
+          <w:i/>
+          <w:iCs/>
+        </w:rPr>
+        <w:t xml:space="preserve">Thaler v. Perlmutter</w:t>
+      </w:r>
+      <w:r>
+        <w:t xml:space="preserve"> </w:t>
+      </w:r>
+      <w:r>
+        <w:t xml:space="preserve">is distinguishable on this same ground: copyright requires a human author whose creative expression resides in the work, while work product requires a human preparer whose strategic preparation is reflected in the materials. The AI is the substrate; the legal actor remains the human.</w:t>
+      </w:r>
+    </w:p>
+    <w:p>
+      <w:pPr>
+        <w:pStyle w:val="BodyText"/>
+      </w:pPr>
+      <w:r>
         <w:t xml:space="preserve">This rule requires courts to draw a distinction that</w:t>
       </w:r>
       <w:r>
@@ -1046,7 +1114,7 @@
         <w:rPr>
           <w:rStyle w:val="FootnoteReference"/>
         </w:rPr>
-        <w:footnoteReference w:id="69"/>
+        <w:footnoteReference w:id="70"/>
       </w:r>
       <w:r>
         <w:t xml:space="preserve"> </w:t>
@@ -1066,7 +1134,7 @@
         <w:rPr>
           <w:rStyle w:val="FootnoteReference"/>
         </w:rPr>
-        <w:footnoteReference w:id="70"/>
+        <w:footnoteReference w:id="71"/>
       </w:r>
       <w:r>
         <w:t xml:space="preserve"> </w:t>
@@ -1144,7 +1212,7 @@
         <w:rPr>
           <w:rStyle w:val="FootnoteReference"/>
         </w:rPr>
-        <w:footnoteReference w:id="71"/>
+        <w:footnoteReference w:id="72"/>
       </w:r>
       <w:r>
         <w:t xml:space="preserve"> </w:t>
@@ -1156,7 +1224,7 @@
         <w:rPr>
           <w:rStyle w:val="FootnoteReference"/>
         </w:rPr>
-        <w:footnoteReference w:id="72"/>
+        <w:footnoteReference w:id="73"/>
       </w:r>
     </w:p>
     <w:p>
@@ -1174,8 +1242,8 @@
         </w:pict>
       </w:r>
     </w:p>
-    <w:bookmarkEnd w:id="75"/>
-    <w:bookmarkStart w:id="81" w:name="X8eb1a49e030d4922ba38a06a64386b888c253b2"/>
+    <w:bookmarkEnd w:id="76"/>
+    <w:bookmarkStart w:id="82" w:name="X8eb1a49e030d4922ba38a06a64386b888c253b2"/>
     <w:p>
       <w:pPr>
         <w:pStyle w:val="Heading2"/>
@@ -1203,7 +1271,7 @@
         <w:rPr>
           <w:rStyle w:val="FootnoteReference"/>
         </w:rPr>
-        <w:footnoteReference w:id="76"/>
+        <w:footnoteReference w:id="77"/>
       </w:r>
       <w:r>
         <w:t xml:space="preserve"> </w:t>
@@ -1223,7 +1291,7 @@
         <w:rPr>
           <w:rStyle w:val="FootnoteReference"/>
         </w:rPr>
-        <w:footnoteReference w:id="78"/>
+        <w:footnoteReference w:id="79"/>
       </w:r>
     </w:p>
     <w:p>
@@ -1237,7 +1305,7 @@
         <w:rPr>
           <w:rStyle w:val="FootnoteReference"/>
         </w:rPr>
-        <w:footnoteReference w:id="79"/>
+        <w:footnoteReference w:id="80"/>
       </w:r>
       <w:r>
         <w:t xml:space="preserve"> </w:t>
@@ -1293,8 +1361,8 @@
         </w:pict>
       </w:r>
     </w:p>
-    <w:bookmarkEnd w:id="81"/>
-    <w:bookmarkStart w:id="82" w:name="X659fe52cba26d28b5b0f48d366b41c1fc25e411"/>
+    <w:bookmarkEnd w:id="82"/>
+    <w:bookmarkStart w:id="83" w:name="X659fe52cba26d28b5b0f48d366b41c1fc25e411"/>
     <w:p>
       <w:pPr>
         <w:pStyle w:val="Heading2"/>
@@ -1334,8 +1402,8 @@
         </w:pict>
       </w:r>
     </w:p>
-    <w:bookmarkEnd w:id="82"/>
-    <w:bookmarkStart w:id="83" w:name="footnotes"/>
+    <w:bookmarkEnd w:id="83"/>
+    <w:bookmarkStart w:id="84" w:name="footnotes"/>
     <w:p>
       <w:pPr>
         <w:pStyle w:val="Heading2"/>
@@ -1370,8 +1438,8 @@
         </w:pict>
       </w:r>
     </w:p>
-    <w:bookmarkEnd w:id="83"/>
     <w:bookmarkEnd w:id="84"/>
+    <w:bookmarkEnd w:id="85"/>
     <w:sectPr>
       <w:footnotePr>
         <w:numRestart w:val="eachSect"/>
@@ -2747,7 +2815,7 @@
         <w:t xml:space="preserve"> </w:t>
       </w:r>
       <w:r>
-        <w:t xml:space="preserve">Carpenter v. United States, 138 S. Ct. 2206 (2018) (by analogy, holding that diminished privacy interests in information shared with a third party do not categorically defeat constitutional protection).</w:t>
+        <w:t xml:space="preserve">Carpenter v. United States, 138 S. Ct. 2206, 2219 (2018) (quoting Riley v. California, 134 S. Ct. 2473, 2488 (2014)) (holding that diminished privacy interests in information shared with a third party do not mean "the Fourth Amendment falls out of the picture entirely").</w:t>
       </w:r>
     </w:p>
   </w:footnote>
@@ -2795,7 +2863,23 @@
         <w:t xml:space="preserve"> </w:t>
       </w:r>
       <w:r>
-        <w:t xml:space="preserve">Warner, 2026 WL 373043, at *4 ("Generative AI programs are tools, not persons.").</w:t>
+        <w:t xml:space="preserve">Hickman v. Taylor, 329 U.S. 495, 510–11 (1947); United States v. Nobles, 422 U.S. 225, 238 (1975);</w:t>
+      </w:r>
+      <w:r>
+        <w:t xml:space="preserve"> </w:t>
+      </w:r>
+      <w:r>
+        <w:rPr>
+          <w:i/>
+          <w:iCs/>
+        </w:rPr>
+        <w:t xml:space="preserve">see also</w:t>
+      </w:r>
+      <w:r>
+        <w:t xml:space="preserve"> </w:t>
+      </w:r>
+      <w:r>
+        <w:t xml:space="preserve">Roberts v. Americable Int'l, Inc., 883 F. Supp. 499 (E.D. Cal. 1995) (denying work-product protection where materials revealed only the conversants' thought processes, not the attorney's); Thaler v. Perlmutter, 130 F.4th 1039 (D.C. Cir. 2025) (holding AI cannot be a copyright author because authorship requires a human creator).</w:t>
       </w:r>
     </w:p>
   </w:footnote>
@@ -2814,20 +2898,17 @@
         <w:t xml:space="preserve"> </w:t>
       </w:r>
       <w:r>
-        <w:t xml:space="preserve">Fed. R. Civ. P. 26(b)(3)(A). The rule's text covers "a party or its representative," which on its face does not limit the representative to an attorney.</w:t>
-      </w:r>
-      <w:r>
-        <w:t xml:space="preserve"> </w:t>
-      </w:r>
-      <w:r>
-        <w:rPr>
-          <w:i/>
-          <w:iCs/>
-        </w:rPr>
-        <w:t xml:space="preserve">See also Shih</w:t>
-      </w:r>
-      <w:r>
-        <w:t xml:space="preserve">, 565 F. Supp. 3d at 574 (extending protection to a non-attorney representative).</w:t>
+        <w:rPr>
+          <w:i/>
+          <w:iCs/>
+        </w:rPr>
+        <w:t xml:space="preserve">See</w:t>
+      </w:r>
+      <w:r>
+        <w:t xml:space="preserve"> </w:t>
+      </w:r>
+      <w:r>
+        <w:t xml:space="preserve">Warner, 2026 WL 373043, at *4 ("Generative AI programs are tools, not persons.").</w:t>
       </w:r>
     </w:p>
   </w:footnote>
@@ -2846,7 +2927,20 @@
         <w:t xml:space="preserve"> </w:t>
       </w:r>
       <w:r>
-        <w:t xml:space="preserve">18 U.S.C. § 3771. The Act currently provides victims with the right to be heard, the right to notice, and the right to restitution, but does not address the protection of their litigation preparation materials.</w:t>
+        <w:t xml:space="preserve">Fed. R. Civ. P. 26(b)(3)(A). The rule's text covers "a party or its representative," which on its face does not limit the representative to an attorney.</w:t>
+      </w:r>
+      <w:r>
+        <w:t xml:space="preserve"> </w:t>
+      </w:r>
+      <w:r>
+        <w:rPr>
+          <w:i/>
+          <w:iCs/>
+        </w:rPr>
+        <w:t xml:space="preserve">See also Shih</w:t>
+      </w:r>
+      <w:r>
+        <w:t xml:space="preserve">, 565 F. Supp. 3d at 574 (extending protection to a non-attorney representative).</w:t>
       </w:r>
     </w:p>
   </w:footnote>
@@ -2865,6 +2959,25 @@
         <w:t xml:space="preserve"> </w:t>
       </w:r>
       <w:r>
+        <w:t xml:space="preserve">18 U.S.C. § 3771. The Act currently provides victims with the right to be heard, the right to notice, and the right to restitution, but does not address the protection of their litigation preparation materials.</w:t>
+      </w:r>
+    </w:p>
+  </w:footnote>
+  <w:footnote w:id="73">
+    <w:p>
+      <w:pPr>
+        <w:pStyle w:val="FootnoteText"/>
+      </w:pPr>
+      <w:r>
+        <w:rPr>
+          <w:rStyle w:val="FootnoteReference"/>
+        </w:rPr>
+        <w:footnoteRef/>
+      </w:r>
+      <w:r>
+        <w:t xml:space="preserve"> </w:t>
+      </w:r>
+      <w:r>
         <w:rPr>
           <w:i/>
           <w:iCs/>
@@ -2893,7 +3006,7 @@
       <w:r>
         <w:t xml:space="preserve"> </w:t>
       </w:r>
-      <w:hyperlink r:id="rId73">
+      <w:hyperlink r:id="rId74">
         <w:r>
           <w:rPr>
             <w:rStyle w:val="Hyperlink"/>
@@ -2907,7 +3020,7 @@
       <w:r>
         <w:t xml:space="preserve">[</w:t>
       </w:r>
-      <w:hyperlink r:id="rId74">
+      <w:hyperlink r:id="rId75">
         <w:r>
           <w:rPr>
             <w:rStyle w:val="Hyperlink"/>
@@ -2920,7 +3033,7 @@
       </w:r>
     </w:p>
   </w:footnote>
-  <w:footnote w:id="76">
+  <w:footnote w:id="77">
     <w:p>
       <w:pPr>
         <w:pStyle w:val="FootnoteText"/>
@@ -2956,7 +3069,7 @@
       <w:r>
         <w:t xml:space="preserve"> </w:t>
       </w:r>
-      <w:hyperlink r:id="rId77">
+      <w:hyperlink r:id="rId78">
         <w:r>
           <w:rPr>
             <w:rStyle w:val="Hyperlink"/>
@@ -2969,7 +3082,7 @@
       </w:r>
     </w:p>
   </w:footnote>
-  <w:footnote w:id="78">
+  <w:footnote w:id="79">
     <w:p>
       <w:pPr>
         <w:pStyle w:val="FootnoteText"/>
@@ -3014,7 +3127,7 @@
       </w:r>
     </w:p>
   </w:footnote>
-  <w:footnote w:id="79">
+  <w:footnote w:id="80">
     <w:p>
       <w:pPr>
         <w:pStyle w:val="FootnoteText"/>
@@ -3050,7 +3163,7 @@
       <w:r>
         <w:t xml:space="preserve"> </w:t>
       </w:r>
-      <w:hyperlink r:id="rId80">
+      <w:hyperlink r:id="rId81">
         <w:r>
           <w:rPr>
             <w:rStyle w:val="Hyperlink"/>

</xml_diff>

<commit_message>
Revert applied edits; add proposed_changes.md document instead
The user wanted a document of the proposed changes, not the changes
themselves. Reverted Slro_paper_final.md and AI_Disclosure_Form.md to
their pre-edit state (commit 903be06 / 370841c). Rebuilt .tex/.pdf/.docx
from reverted source.

New file: _paper/proposed_changes.md catalogs all five proposed edits
(CoCounsel + DeepSeek combined) with before/after, word deltas, three
application packages (Maximal/Conservative/Minimal), and trim candidates
for word-budget management.

Paper restored to 4,889 words; awaiting user sign-off on which package
to actually apply.

Co-Authored-By: Claude Sonnet 4.6 <noreply@anthropic.com>
</commit_message>
<xml_diff>
--- a/_paper/Slro_paper_final.docx
+++ b/_paper/Slro_paper_final.docx
@@ -2,7 +2,7 @@
 <file path=word/document.xml><?xml version="1.0" encoding="utf-8"?>
 <w:document xmlns:w="http://schemas.openxmlformats.org/wordprocessingml/2006/main" xmlns:m="http://schemas.openxmlformats.org/officeDocument/2006/math" xmlns:r="http://schemas.openxmlformats.org/officeDocument/2006/relationships" xmlns:o="urn:schemas-microsoft-com:office:office" xmlns:v="urn:schemas-microsoft-com:vml" xmlns:w10="urn:schemas-microsoft-com:office:word" xmlns:a="http://schemas.openxmlformats.org/drawingml/2006/main" xmlns:pic="http://schemas.openxmlformats.org/drawingml/2006/picture" xmlns:wp="http://schemas.openxmlformats.org/drawingml/2006/wordprocessingDrawing">
   <w:body>
-    <w:bookmarkStart w:id="85" w:name="protected-legal-thought-in-the-age-of-ai"/>
+    <w:bookmarkStart w:id="84" w:name="protected-legal-thought-in-the-age-of-ai"/>
     <w:p>
       <w:pPr>
         <w:pStyle w:val="Heading1"/>
@@ -311,7 +311,7 @@
         <w:pStyle w:val="BodyText"/>
       </w:pPr>
       <w:r>
-        <w:t xml:space="preserve">The emerging divide is not about whether AI is reliable, whether its outputs are accurate, or whether its use constitutes the unauthorized practice of law. It is about whether the protection of legal preparation—the ability to research, analyze, and strategize without surrendering that work to the opposing side—attaches to the nature of the work or the status of the person performing it. This Essay enters an empty field. Existing scholarship treats AI as a civil rights threat in employment, housing, and criminal sentencing contexts, but has not yet examined how AI's role in legal preparation itself implicates equal protection, procedural fairness, and access to courts. This Essay argues that the fracture reveals a structural inequality in the distribution of protected legal thought, one that AI has made visible and that civil rights law is uniquely positioned to address. At its most extreme, this fracture leaves crime victims—who are not parties to the criminal proceeding, not represented by the prosecutor, and not entitled to appointed counsel—with no work-product framework for their preparation at all. The core thesis is that work-product protection is increasingly determined by professional credential and subscription tier rather than by function, and that this development conditions the exercise of fundamental rights on status and access.</w:t>
+        <w:t xml:space="preserve">The emerging divide is not about whether AI is reliable, whether its outputs are accurate, or whether its use constitutes the unauthorized practice of law. It is about whether the protection of legal preparation—the ability to research, analyze, and strategize without surrendering that work to the opposing side—attaches to the nature of the work or the status of the person performing it. This Essay argues that the fracture reveals a structural inequality in the distribution of protected legal thought, one that AI has made visible and that civil rights law is uniquely positioned to address. At its most extreme, this fracture leaves crime victims—who are not parties to the criminal proceeding, not represented by the prosecutor, and not entitled to appointed counsel—with no work-product framework for their preparation at all. The core thesis is that work-product protection is increasingly determined by professional credential and subscription tier rather than by function, and that this development conditions the exercise of fundamental rights on status and access.</w:t>
       </w:r>
     </w:p>
     <w:p>
@@ -715,23 +715,7 @@
         <w:pStyle w:val="BodyText"/>
       </w:pPr>
       <w:r>
-        <w:t xml:space="preserve">This produces a status-based distinction in the protection of legal preparation that implicates equal protection principles in ways courts are only beginning to confront.</w:t>
-      </w:r>
-      <w:r>
-        <w:t xml:space="preserve"> </w:t>
-      </w:r>
-      <w:r>
-        <w:rPr>
-          <w:i/>
-          <w:iCs/>
-        </w:rPr>
-        <w:t xml:space="preserve">Morgan</w:t>
-      </w:r>
-      <w:r>
-        <w:t xml:space="preserve"> </w:t>
-      </w:r>
-      <w:r>
-        <w:t xml:space="preserve">itself recognized that conditioning AI work-product protection on attorney involvement "would further disadvantage unrepresented litigants"—the precise distributive consequence that civil rights scrutiny exists to address.</w:t>
+        <w:t xml:space="preserve">This produces a status-based distinction in the protection of legal preparation that implicates equal protection principles in ways courts have not yet confronted directly but cannot indefinitely avoid, particularly where the distinction systematically disadvantages those without access to counsel or protected channels of preparation.</w:t>
       </w:r>
       <w:r>
         <w:rPr>
@@ -971,7 +955,7 @@
     </w:p>
     <w:bookmarkEnd w:id="65"/>
     <w:bookmarkEnd w:id="66"/>
-    <w:bookmarkStart w:id="76" w:name="X2e3abd68c33ba2037424b86b00463db66793c21"/>
+    <w:bookmarkStart w:id="75" w:name="X2e3abd68c33ba2037424b86b00463db66793c21"/>
     <w:p>
       <w:pPr>
         <w:pStyle w:val="Heading2"/>
@@ -1040,23 +1024,23 @@
         <w:pStyle w:val="BodyText"/>
       </w:pPr>
       <w:r>
-        <w:t xml:space="preserve">A deeper objection challenges the rule on doctrinal foundations: AI output, the argument runs, lacks the human mental impressions that</w:t>
-      </w:r>
-      <w:r>
-        <w:t xml:space="preserve"> </w:t>
-      </w:r>
-      <w:r>
-        <w:rPr>
-          <w:i/>
-          <w:iCs/>
-        </w:rPr>
-        <w:t xml:space="preserve">Hickman</w:t>
-      </w:r>
-      <w:r>
-        <w:t xml:space="preserve"> </w:t>
-      </w:r>
-      <w:r>
-        <w:t xml:space="preserve">and Rule 26(b)(3) exist to protect.</w:t>
+        <w:t xml:space="preserve">This rule requires courts to draw a distinction that</w:t>
+      </w:r>
+      <w:r>
+        <w:t xml:space="preserve"> </w:t>
+      </w:r>
+      <w:r>
+        <w:rPr>
+          <w:i/>
+          <w:iCs/>
+        </w:rPr>
+        <w:t xml:space="preserve">Heppner</w:t>
+      </w:r>
+      <w:r>
+        <w:t xml:space="preserve"> </w:t>
+      </w:r>
+      <w:r>
+        <w:t xml:space="preserve">collapsed. The mere fact that an AI system processes a prompt does not necessarily constitute disclosure to an adversary or third party in the traditional sense, particularly where no evidence of retention or adversarial access is shown.</w:t>
       </w:r>
       <w:r>
         <w:rPr>
@@ -1068,23 +1052,7 @@
         <w:t xml:space="preserve"> </w:t>
       </w:r>
       <w:r>
-        <w:t xml:space="preserve">The objection is misplaced. The functional rule does not protect AI output as algorithmic product; it protects the human preparation activity—the prompts, the directional choices, the integration of output into a litigation strategy—that embeds the preparer's mental impressions as surely as a paralegal's research memorandum does. The copyright analogy under</w:t>
-      </w:r>
-      <w:r>
-        <w:t xml:space="preserve"> </w:t>
-      </w:r>
-      <w:r>
-        <w:rPr>
-          <w:i/>
-          <w:iCs/>
-        </w:rPr>
-        <w:t xml:space="preserve">Thaler v. Perlmutter</w:t>
-      </w:r>
-      <w:r>
-        <w:t xml:space="preserve"> </w:t>
-      </w:r>
-      <w:r>
-        <w:t xml:space="preserve">is distinguishable on this same ground: copyright requires a human author whose creative expression resides in the work, while work product requires a human preparer whose strategic preparation is reflected in the materials. The AI is the substrate; the legal actor remains the human.</w:t>
+        <w:t xml:space="preserve">The legally relevant events are onward sharing, human review by platform staff, government subpoena of stored data, or actual adversarial access—not the computational inference itself. Treating the potential for future training or data retention as an immediate waiver of protection is equivalent to saying that an email provider's ability to scan messages for spam waives attorney-client privilege over the scanned communications. The doctrine does not require that result, and courts should not adopt it.</w:t>
       </w:r>
     </w:p>
     <w:p>
@@ -1092,23 +1060,7 @@
         <w:pStyle w:val="BodyText"/>
       </w:pPr>
       <w:r>
-        <w:t xml:space="preserve">This rule requires courts to draw a distinction that</w:t>
-      </w:r>
-      <w:r>
-        <w:t xml:space="preserve"> </w:t>
-      </w:r>
-      <w:r>
-        <w:rPr>
-          <w:i/>
-          <w:iCs/>
-        </w:rPr>
-        <w:t xml:space="preserve">Heppner</w:t>
-      </w:r>
-      <w:r>
-        <w:t xml:space="preserve"> </w:t>
-      </w:r>
-      <w:r>
-        <w:t xml:space="preserve">collapsed. The mere fact that an AI system processes a prompt does not necessarily constitute disclosure to an adversary or third party in the traditional sense, particularly where no evidence of retention or adversarial access is shown.</w:t>
+        <w:t xml:space="preserve">The functional rule is consistent with the text of Federal Rule of Civil Procedure 26(b)(3)(A), which protects materials prepared "by or for another party or its representative" without credential-limiting language.</w:t>
       </w:r>
       <w:r>
         <w:rPr>
@@ -1120,7 +1072,33 @@
         <w:t xml:space="preserve"> </w:t>
       </w:r>
       <w:r>
-        <w:t xml:space="preserve">The legally relevant events are onward sharing, human review by platform staff, government subpoena of stored data, or actual adversarial access—not the computational inference itself. Treating the potential for future training or data retention as an immediate waiver of protection is equivalent to saying that an email provider's ability to scan messages for spam waives attorney-client privilege over the scanned communications. The doctrine does not require that result, and courts should not adopt it.</w:t>
+        <w:rPr>
+          <w:i/>
+          <w:iCs/>
+        </w:rPr>
+        <w:t xml:space="preserve">Warner</w:t>
+      </w:r>
+      <w:r>
+        <w:t xml:space="preserve"> </w:t>
+      </w:r>
+      <w:r>
+        <w:t xml:space="preserve">and</w:t>
+      </w:r>
+      <w:r>
+        <w:t xml:space="preserve"> </w:t>
+      </w:r>
+      <w:r>
+        <w:rPr>
+          <w:i/>
+          <w:iCs/>
+        </w:rPr>
+        <w:t xml:space="preserve">Morgan</w:t>
+      </w:r>
+      <w:r>
+        <w:t xml:space="preserve"> </w:t>
+      </w:r>
+      <w:r>
+        <w:t xml:space="preserve">already take this path. Extending it to all persons preparing in anticipation of litigation—regardless of whether they are represented, self-represented, or preparing to participate as a crime victim in a criminal proceeding—is a doctrinal development, not a statutory amendment.</w:t>
       </w:r>
     </w:p>
     <w:p>
@@ -1128,7 +1106,39 @@
         <w:pStyle w:val="BodyText"/>
       </w:pPr>
       <w:r>
-        <w:t xml:space="preserve">The functional rule is consistent with the text of Federal Rule of Civil Procedure 26(b)(3)(A), which protects materials prepared "by or for another party or its representative" without credential-limiting language.</w:t>
+        <w:t xml:space="preserve">Three paths are available. Judicial reinterpretation can adopt the functional rule as</w:t>
+      </w:r>
+      <w:r>
+        <w:t xml:space="preserve"> </w:t>
+      </w:r>
+      <w:r>
+        <w:rPr>
+          <w:i/>
+          <w:iCs/>
+        </w:rPr>
+        <w:t xml:space="preserve">Warner</w:t>
+      </w:r>
+      <w:r>
+        <w:t xml:space="preserve"> </w:t>
+      </w:r>
+      <w:r>
+        <w:t xml:space="preserve">and</w:t>
+      </w:r>
+      <w:r>
+        <w:t xml:space="preserve"> </w:t>
+      </w:r>
+      <w:r>
+        <w:rPr>
+          <w:i/>
+          <w:iCs/>
+        </w:rPr>
+        <w:t xml:space="preserve">Morgan</w:t>
+      </w:r>
+      <w:r>
+        <w:t xml:space="preserve"> </w:t>
+      </w:r>
+      <w:r>
+        <w:t xml:space="preserve">have begun to do. Rulemaking can amend the Federal Rules of Civil Procedure and parallel state rules to explicitly extend protection to AI-assisted preparation by self-represented parties and by parties preparing for any legal proceeding, regardless of platform tier. And legislation can address the specific gaps—for example, targeted amendments to the Crime Victims' Rights Act</w:t>
       </w:r>
       <w:r>
         <w:rPr>
@@ -1140,91 +1150,13 @@
         <w:t xml:space="preserve"> </w:t>
       </w:r>
       <w:r>
-        <w:rPr>
-          <w:i/>
-          <w:iCs/>
-        </w:rPr>
-        <w:t xml:space="preserve">Warner</w:t>
-      </w:r>
-      <w:r>
-        <w:t xml:space="preserve"> </w:t>
-      </w:r>
-      <w:r>
-        <w:t xml:space="preserve">and</w:t>
-      </w:r>
-      <w:r>
-        <w:t xml:space="preserve"> </w:t>
-      </w:r>
-      <w:r>
-        <w:rPr>
-          <w:i/>
-          <w:iCs/>
-        </w:rPr>
-        <w:t xml:space="preserve">Morgan</w:t>
-      </w:r>
-      <w:r>
-        <w:t xml:space="preserve"> </w:t>
-      </w:r>
-      <w:r>
-        <w:t xml:space="preserve">already take this path. Extending it to all persons preparing in anticipation of litigation—regardless of whether they are represented, self-represented, or preparing to participate as a crime victim in a criminal proceeding—is a doctrinal development, not a statutory amendment.</w:t>
-      </w:r>
-    </w:p>
-    <w:p>
-      <w:pPr>
-        <w:pStyle w:val="BodyText"/>
-      </w:pPr>
-      <w:r>
-        <w:t xml:space="preserve">Three paths are available. Judicial reinterpretation can adopt the functional rule as</w:t>
-      </w:r>
-      <w:r>
-        <w:t xml:space="preserve"> </w:t>
-      </w:r>
-      <w:r>
-        <w:rPr>
-          <w:i/>
-          <w:iCs/>
-        </w:rPr>
-        <w:t xml:space="preserve">Warner</w:t>
-      </w:r>
-      <w:r>
-        <w:t xml:space="preserve"> </w:t>
-      </w:r>
-      <w:r>
-        <w:t xml:space="preserve">and</w:t>
-      </w:r>
-      <w:r>
-        <w:t xml:space="preserve"> </w:t>
-      </w:r>
-      <w:r>
-        <w:rPr>
-          <w:i/>
-          <w:iCs/>
-        </w:rPr>
-        <w:t xml:space="preserve">Morgan</w:t>
-      </w:r>
-      <w:r>
-        <w:t xml:space="preserve"> </w:t>
-      </w:r>
-      <w:r>
-        <w:t xml:space="preserve">have begun to do. Rulemaking can amend the Federal Rules of Civil Procedure and parallel state rules to explicitly extend protection to AI-assisted preparation by self-represented parties and by parties preparing for any legal proceeding, regardless of platform tier. And legislation can address the specific gaps—for example, targeted amendments to the Crime Victims' Rights Act</w:t>
+        <w:t xml:space="preserve">or model provisions for state victims' rights campaigns—to ensure that crime victims' AI-assisted preparation materials are not discoverable by the very defendants whose conduct they are documenting.</w:t>
       </w:r>
       <w:r>
         <w:rPr>
           <w:rStyle w:val="FootnoteReference"/>
         </w:rPr>
         <w:footnoteReference w:id="72"/>
-      </w:r>
-      <w:r>
-        <w:t xml:space="preserve"> </w:t>
-      </w:r>
-      <w:r>
-        <w:t xml:space="preserve">or model provisions for state victims' rights campaigns—to ensure that crime victims' AI-assisted preparation materials are not discoverable by the very defendants whose conduct they are documenting.</w:t>
-      </w:r>
-      <w:r>
-        <w:rPr>
-          <w:rStyle w:val="FootnoteReference"/>
-        </w:rPr>
-        <w:footnoteReference w:id="73"/>
       </w:r>
     </w:p>
     <w:p>
@@ -1242,8 +1174,8 @@
         </w:pict>
       </w:r>
     </w:p>
-    <w:bookmarkEnd w:id="76"/>
-    <w:bookmarkStart w:id="82" w:name="X8eb1a49e030d4922ba38a06a64386b888c253b2"/>
+    <w:bookmarkEnd w:id="75"/>
+    <w:bookmarkStart w:id="81" w:name="X8eb1a49e030d4922ba38a06a64386b888c253b2"/>
     <w:p>
       <w:pPr>
         <w:pStyle w:val="Heading2"/>
@@ -1271,7 +1203,7 @@
         <w:rPr>
           <w:rStyle w:val="FootnoteReference"/>
         </w:rPr>
-        <w:footnoteReference w:id="77"/>
+        <w:footnoteReference w:id="76"/>
       </w:r>
       <w:r>
         <w:t xml:space="preserve"> </w:t>
@@ -1291,21 +1223,21 @@
         <w:rPr>
           <w:rStyle w:val="FootnoteReference"/>
         </w:rPr>
+        <w:footnoteReference w:id="78"/>
+      </w:r>
+    </w:p>
+    <w:p>
+      <w:pPr>
+        <w:pStyle w:val="BodyText"/>
+      </w:pPr>
+      <w:r>
+        <w:t xml:space="preserve">These are not speculative technologies. They are operational components of a governance architecture that has been publicly described and deposited.</w:t>
+      </w:r>
+      <w:r>
+        <w:rPr>
+          <w:rStyle w:val="FootnoteReference"/>
+        </w:rPr>
         <w:footnoteReference w:id="79"/>
-      </w:r>
-    </w:p>
-    <w:p>
-      <w:pPr>
-        <w:pStyle w:val="BodyText"/>
-      </w:pPr>
-      <w:r>
-        <w:t xml:space="preserve">These are not speculative technologies. They are operational components of a governance architecture that has been publicly described and deposited.</w:t>
-      </w:r>
-      <w:r>
-        <w:rPr>
-          <w:rStyle w:val="FootnoteReference"/>
-        </w:rPr>
-        <w:footnoteReference w:id="80"/>
       </w:r>
       <w:r>
         <w:t xml:space="preserve"> </w:t>
@@ -1361,8 +1293,8 @@
         </w:pict>
       </w:r>
     </w:p>
-    <w:bookmarkEnd w:id="82"/>
-    <w:bookmarkStart w:id="83" w:name="X659fe52cba26d28b5b0f48d366b41c1fc25e411"/>
+    <w:bookmarkEnd w:id="81"/>
+    <w:bookmarkStart w:id="82" w:name="X659fe52cba26d28b5b0f48d366b41c1fc25e411"/>
     <w:p>
       <w:pPr>
         <w:pStyle w:val="Heading2"/>
@@ -1402,8 +1334,8 @@
         </w:pict>
       </w:r>
     </w:p>
-    <w:bookmarkEnd w:id="83"/>
-    <w:bookmarkStart w:id="84" w:name="footnotes"/>
+    <w:bookmarkEnd w:id="82"/>
+    <w:bookmarkStart w:id="83" w:name="footnotes"/>
     <w:p>
       <w:pPr>
         <w:pStyle w:val="Heading2"/>
@@ -1438,8 +1370,8 @@
         </w:pict>
       </w:r>
     </w:p>
+    <w:bookmarkEnd w:id="83"/>
     <w:bookmarkEnd w:id="84"/>
-    <w:bookmarkEnd w:id="85"/>
     <w:sectPr>
       <w:footnotePr>
         <w:numRestart w:val="eachSect"/>
@@ -2815,7 +2747,7 @@
         <w:t xml:space="preserve"> </w:t>
       </w:r>
       <w:r>
-        <w:t xml:space="preserve">Carpenter v. United States, 138 S. Ct. 2206, 2219 (2018) (quoting Riley v. California, 134 S. Ct. 2473, 2488 (2014)) (holding that diminished privacy interests in information shared with a third party do not mean "the Fourth Amendment falls out of the picture entirely").</w:t>
+        <w:t xml:space="preserve">Carpenter v. United States, 138 S. Ct. 2206 (2018) (by analogy, holding that diminished privacy interests in information shared with a third party do not categorically defeat constitutional protection).</w:t>
       </w:r>
     </w:p>
   </w:footnote>
@@ -2863,23 +2795,7 @@
         <w:t xml:space="preserve"> </w:t>
       </w:r>
       <w:r>
-        <w:t xml:space="preserve">Hickman v. Taylor, 329 U.S. 495, 510–11 (1947); United States v. Nobles, 422 U.S. 225, 238 (1975);</w:t>
-      </w:r>
-      <w:r>
-        <w:t xml:space="preserve"> </w:t>
-      </w:r>
-      <w:r>
-        <w:rPr>
-          <w:i/>
-          <w:iCs/>
-        </w:rPr>
-        <w:t xml:space="preserve">see also</w:t>
-      </w:r>
-      <w:r>
-        <w:t xml:space="preserve"> </w:t>
-      </w:r>
-      <w:r>
-        <w:t xml:space="preserve">Roberts v. Americable Int'l, Inc., 883 F. Supp. 499 (E.D. Cal. 1995) (denying work-product protection where materials revealed only the conversants' thought processes, not the attorney's); Thaler v. Perlmutter, 130 F.4th 1039 (D.C. Cir. 2025) (holding AI cannot be a copyright author because authorship requires a human creator).</w:t>
+        <w:t xml:space="preserve">Warner, 2026 WL 373043, at *4 ("Generative AI programs are tools, not persons.").</w:t>
       </w:r>
     </w:p>
   </w:footnote>
@@ -2898,17 +2814,20 @@
         <w:t xml:space="preserve"> </w:t>
       </w:r>
       <w:r>
-        <w:rPr>
-          <w:i/>
-          <w:iCs/>
-        </w:rPr>
-        <w:t xml:space="preserve">See</w:t>
-      </w:r>
-      <w:r>
-        <w:t xml:space="preserve"> </w:t>
-      </w:r>
-      <w:r>
-        <w:t xml:space="preserve">Warner, 2026 WL 373043, at *4 ("Generative AI programs are tools, not persons.").</w:t>
+        <w:t xml:space="preserve">Fed. R. Civ. P. 26(b)(3)(A). The rule's text covers "a party or its representative," which on its face does not limit the representative to an attorney.</w:t>
+      </w:r>
+      <w:r>
+        <w:t xml:space="preserve"> </w:t>
+      </w:r>
+      <w:r>
+        <w:rPr>
+          <w:i/>
+          <w:iCs/>
+        </w:rPr>
+        <w:t xml:space="preserve">See also Shih</w:t>
+      </w:r>
+      <w:r>
+        <w:t xml:space="preserve">, 565 F. Supp. 3d at 574 (extending protection to a non-attorney representative).</w:t>
       </w:r>
     </w:p>
   </w:footnote>
@@ -2927,20 +2846,7 @@
         <w:t xml:space="preserve"> </w:t>
       </w:r>
       <w:r>
-        <w:t xml:space="preserve">Fed. R. Civ. P. 26(b)(3)(A). The rule's text covers "a party or its representative," which on its face does not limit the representative to an attorney.</w:t>
-      </w:r>
-      <w:r>
-        <w:t xml:space="preserve"> </w:t>
-      </w:r>
-      <w:r>
-        <w:rPr>
-          <w:i/>
-          <w:iCs/>
-        </w:rPr>
-        <w:t xml:space="preserve">See also Shih</w:t>
-      </w:r>
-      <w:r>
-        <w:t xml:space="preserve">, 565 F. Supp. 3d at 574 (extending protection to a non-attorney representative).</w:t>
+        <w:t xml:space="preserve">18 U.S.C. § 3771. The Act currently provides victims with the right to be heard, the right to notice, and the right to restitution, but does not address the protection of their litigation preparation materials.</w:t>
       </w:r>
     </w:p>
   </w:footnote>
@@ -2959,25 +2865,6 @@
         <w:t xml:space="preserve"> </w:t>
       </w:r>
       <w:r>
-        <w:t xml:space="preserve">18 U.S.C. § 3771. The Act currently provides victims with the right to be heard, the right to notice, and the right to restitution, but does not address the protection of their litigation preparation materials.</w:t>
-      </w:r>
-    </w:p>
-  </w:footnote>
-  <w:footnote w:id="73">
-    <w:p>
-      <w:pPr>
-        <w:pStyle w:val="FootnoteText"/>
-      </w:pPr>
-      <w:r>
-        <w:rPr>
-          <w:rStyle w:val="FootnoteReference"/>
-        </w:rPr>
-        <w:footnoteRef/>
-      </w:r>
-      <w:r>
-        <w:t xml:space="preserve"> </w:t>
-      </w:r>
-      <w:r>
         <w:rPr>
           <w:i/>
           <w:iCs/>
@@ -3006,7 +2893,7 @@
       <w:r>
         <w:t xml:space="preserve"> </w:t>
       </w:r>
-      <w:hyperlink r:id="rId74">
+      <w:hyperlink r:id="rId73">
         <w:r>
           <w:rPr>
             <w:rStyle w:val="Hyperlink"/>
@@ -3020,7 +2907,7 @@
       <w:r>
         <w:t xml:space="preserve">[</w:t>
       </w:r>
-      <w:hyperlink r:id="rId75">
+      <w:hyperlink r:id="rId74">
         <w:r>
           <w:rPr>
             <w:rStyle w:val="Hyperlink"/>
@@ -3033,7 +2920,7 @@
       </w:r>
     </w:p>
   </w:footnote>
-  <w:footnote w:id="77">
+  <w:footnote w:id="76">
     <w:p>
       <w:pPr>
         <w:pStyle w:val="FootnoteText"/>
@@ -3069,7 +2956,7 @@
       <w:r>
         <w:t xml:space="preserve"> </w:t>
       </w:r>
-      <w:hyperlink r:id="rId78">
+      <w:hyperlink r:id="rId77">
         <w:r>
           <w:rPr>
             <w:rStyle w:val="Hyperlink"/>
@@ -3082,6 +2969,51 @@
       </w:r>
     </w:p>
   </w:footnote>
+  <w:footnote w:id="78">
+    <w:p>
+      <w:pPr>
+        <w:pStyle w:val="FootnoteText"/>
+      </w:pPr>
+      <w:r>
+        <w:rPr>
+          <w:rStyle w:val="FootnoteReference"/>
+        </w:rPr>
+        <w:footnoteRef/>
+      </w:r>
+      <w:r>
+        <w:t xml:space="preserve"> </w:t>
+      </w:r>
+      <w:r>
+        <w:rPr>
+          <w:i/>
+          <w:iCs/>
+        </w:rPr>
+        <w:t xml:space="preserve">See</w:t>
+      </w:r>
+      <w:r>
+        <w:t xml:space="preserve"> </w:t>
+      </w:r>
+      <w:r>
+        <w:t xml:space="preserve">[Author],</w:t>
+      </w:r>
+      <w:r>
+        <w:t xml:space="preserve"> </w:t>
+      </w:r>
+      <w:r>
+        <w:rPr>
+          <w:i/>
+          <w:iCs/>
+        </w:rPr>
+        <w:t xml:space="preserve">supra</w:t>
+      </w:r>
+      <w:r>
+        <w:t xml:space="preserve"> </w:t>
+      </w:r>
+      <w:r>
+        <w:t xml:space="preserve">note 36, at §§ 4–5 (describing the six-gate verification protocol and recursion testing methodology).</w:t>
+      </w:r>
+    </w:p>
+  </w:footnote>
   <w:footnote w:id="79">
     <w:p>
       <w:pPr>
@@ -3097,16 +3029,6 @@
         <w:t xml:space="preserve"> </w:t>
       </w:r>
       <w:r>
-        <w:rPr>
-          <w:i/>
-          <w:iCs/>
-        </w:rPr>
-        <w:t xml:space="preserve">See</w:t>
-      </w:r>
-      <w:r>
-        <w:t xml:space="preserve"> </w:t>
-      </w:r>
-      <w:r>
         <w:t xml:space="preserve">[Author],</w:t>
       </w:r>
       <w:r>
@@ -3117,41 +3039,6 @@
           <w:i/>
           <w:iCs/>
         </w:rPr>
-        <w:t xml:space="preserve">supra</w:t>
-      </w:r>
-      <w:r>
-        <w:t xml:space="preserve"> </w:t>
-      </w:r>
-      <w:r>
-        <w:t xml:space="preserve">note 36, at §§ 4–5 (describing the six-gate verification protocol and recursion testing methodology).</w:t>
-      </w:r>
-    </w:p>
-  </w:footnote>
-  <w:footnote w:id="80">
-    <w:p>
-      <w:pPr>
-        <w:pStyle w:val="FootnoteText"/>
-      </w:pPr>
-      <w:r>
-        <w:rPr>
-          <w:rStyle w:val="FootnoteReference"/>
-        </w:rPr>
-        <w:footnoteRef/>
-      </w:r>
-      <w:r>
-        <w:t xml:space="preserve"> </w:t>
-      </w:r>
-      <w:r>
-        <w:t xml:space="preserve">[Author],</w:t>
-      </w:r>
-      <w:r>
-        <w:t xml:space="preserve"> </w:t>
-      </w:r>
-      <w:r>
-        <w:rPr>
-          <w:i/>
-          <w:iCs/>
-        </w:rPr>
         <w:t xml:space="preserve">Experimental Record for A Conservation Law for Commitment in Language Under Transformative Compression and Recursive Application</w:t>
       </w:r>
       <w:r>
@@ -3163,7 +3050,7 @@
       <w:r>
         <w:t xml:space="preserve"> </w:t>
       </w:r>
-      <w:hyperlink r:id="rId81">
+      <w:hyperlink r:id="rId80">
         <w:r>
           <w:rPr>
             <w:rStyle w:val="Hyperlink"/>

</xml_diff>

<commit_message>
Add Lucas v. Scharf (fn 27) + Cendant/Bibby (fn 33)
Two more high-value items from CoCounsel research that we hadn't yet pulled:

Item A — fn 27: Added Lucas v. Scharf, 2026 WL 642917 (W.D.N.C. Feb. 25,
2026) as supporting authority for the pro se exposure point. It's the
only post-Heppner federal case to mention AI privilege; warns pro se
litigants their AI conversations "are not privileged."

Item B — fn 33: Strengthened the non-attorney work-product foundation
from a single district-court cite (Shih) to a Third Circuit cite plus
two district cases:
- In re Cendant Corp. Sec. Litig., 343 F.3d 658 (3d Cir. 2003)
- United States ex rel. Bibby v. Wells Fargo Bank, N.A., 165 F. Supp. 3d
  1319 (N.D. Ga. 2015)

Net cost: ~75 markdown words. Estimated user Word count: ~4,075 (still
~925 words of headroom under 5,000 ceiling).

Co-Authored-By: Claude Sonnet 4.6 <noreply@anthropic.com>
</commit_message>
<xml_diff>
--- a/_paper/Slro_paper_final.docx
+++ b/_paper/Slro_paper_final.docx
@@ -2696,7 +2696,23 @@
         </w:r>
       </w:hyperlink>
       <w:r>
-        <w:t xml:space="preserve">] (analyzing privilege risks where defendants use consumer AI without counsel direction).</w:t>
+        <w:t xml:space="preserve">] (analyzing privilege risks where defendants use consumer AI without counsel direction);</w:t>
+      </w:r>
+      <w:r>
+        <w:t xml:space="preserve"> </w:t>
+      </w:r>
+      <w:r>
+        <w:rPr>
+          <w:i/>
+          <w:iCs/>
+        </w:rPr>
+        <w:t xml:space="preserve">see also</w:t>
+      </w:r>
+      <w:r>
+        <w:t xml:space="preserve"> </w:t>
+      </w:r>
+      <w:r>
+        <w:t xml:space="preserve">Lucas v. Scharf, 2026 WL 642917 (W.D.N.C. Feb. 25, 2026) (warning pro se litigants that "conversations" with AI tools "are not privileged and may be subject to discovery").</w:t>
       </w:r>
     </w:p>
   </w:footnote>
@@ -2940,7 +2956,7 @@
         <w:t xml:space="preserve">See also Shih</w:t>
       </w:r>
       <w:r>
-        <w:t xml:space="preserve">, 565 F. Supp. 3d at 574 (extending protection to a non-attorney representative).</w:t>
+        <w:t xml:space="preserve">, 565 F. Supp. 3d at 574 (extending protection to a non-attorney representative); In re Cendant Corp. Sec. Litig., 343 F.3d 658 (3d Cir. 2003) (litigation consultants qualify as non-attorney representatives under the doctrine); United States ex rel. Bibby v. Wells Fargo Bank, N.A., 165 F. Supp. 3d 1319 (N.D. Ga. 2015) (extending protection to non-attorney investigator acting as attorney's agent).</w:t>
       </w:r>
     </w:p>
   </w:footnote>

</xml_diff>

<commit_message>
Fix Bluebook errors in fns 8, 25, 31; trim one redundant sentence
Bluebook fixes (case names were missing on first cite in footnote):
- fn 8: Add "Hickman v. Taylor," before "329 U.S. 495 (1947)"
- fn 25: Convert from bare "422 U.S. 806 (1975)" to proper short form
  "*Faretta*, 422 U.S. 806." (full cite is in fn 21)
- fn 31: Add "Shih v. Petal Card, Inc.," before "565 F. Supp. 3d 557, 574"

Trim:
- Body line 58: removed "Publicly available materials do not establish
  that enterprise and consumer processing paths are architecturally
  segregated" — pure redundancy with adjacent sentence + fn 18

Did NOT trim Faretta full cite from fn 21 (would orphan fn 25's short
form).

Per user direction: keeping the additional 365 words for topic
complexity; SLRO 5,000-word ceiling is "strong preference," not hard
limit (10,000 = auto-reject). Final approach: trim only genuine
redundancy, preserve substantive content.

Co-Authored-By: Claude Sonnet 4.6 <noreply@anthropic.com>
</commit_message>
<xml_diff>
--- a/_paper/Slro_paper_final.docx
+++ b/_paper/Slro_paper_final.docx
@@ -575,7 +575,7 @@
         <w:t xml:space="preserve"> </w:t>
       </w:r>
       <w:r>
-        <w:t xml:space="preserve">Enterprise agreements typically prohibit the model provider from training on customer data, include SOC 2 compliance certifications, and add confidentiality provisions. They do not, however, publicly establish that the model's internal computation is segregated between enterprise and consumer data paths. Publicly available materials do not establish that enterprise and consumer processing paths are architecturally segregated. The separation is addressed through data governance promises, not architectural isolation.</w:t>
+        <w:t xml:space="preserve">Enterprise agreements typically prohibit the model provider from training on customer data, include SOC 2 compliance certifications, and add confidentiality provisions. They do not, however, publicly establish that the model's internal computation is segregated between enterprise and consumer data paths. The separation is addressed through data governance promises, not architectural isolation.</w:t>
       </w:r>
       <w:r>
         <w:rPr>
@@ -1657,7 +1657,7 @@
         <w:t xml:space="preserve"> </w:t>
       </w:r>
       <w:r>
-        <w:t xml:space="preserve">329 U.S. 495 (1947); Fed. R. Civ. P. 26(b)(3)(A). The criminal equivalent in New York is CPL § 245.65.</w:t>
+        <w:t xml:space="preserve">Hickman v. Taylor, 329 U.S. 495 (1947); Fed. R. Civ. P. 26(b)(3)(A). The criminal equivalent in New York is CPL § 245.65.</w:t>
       </w:r>
     </w:p>
   </w:footnote>
@@ -2607,7 +2607,14 @@
         <w:t xml:space="preserve"> </w:t>
       </w:r>
       <w:r>
-        <w:t xml:space="preserve">422 U.S. 806 (1975).</w:t>
+        <w:rPr>
+          <w:i/>
+          <w:iCs/>
+        </w:rPr>
+        <w:t xml:space="preserve">Faretta</w:t>
+      </w:r>
+      <w:r>
+        <w:t xml:space="preserve">, 422 U.S. 806.</w:t>
       </w:r>
     </w:p>
   </w:footnote>
@@ -2850,7 +2857,7 @@
         <w:t xml:space="preserve"> </w:t>
       </w:r>
       <w:r>
-        <w:t xml:space="preserve">565 F. Supp. 3d 557, 574 (S.D.N.Y. 2021) (extending work-product protection to litigation preparation by a non-attorney corporate representative acting in anticipation of suit).</w:t>
+        <w:t xml:space="preserve">Shih v. Petal Card, Inc., 565 F. Supp. 3d 557, 574 (S.D.N.Y. 2021) (extending work-product protection to litigation preparation by a non-attorney corporate representative acting in anticipation of suit).</w:t>
       </w:r>
     </w:p>
   </w:footnote>

</xml_diff>

<commit_message>
Bluebook 22 cleanup: italicize all case-name short forms
Bluebook 22 requires case-name italicization in short-form citations
within footnotes. Six footnotes were affected:

- fn 2: Heppner → *Heppner*
- fn 4: Warner → *Warner*
- fn 11: Heppner → *Heppner*; Warner → *Warner*
- fn 16: Heppner → *Heppner*
- fn 21: Griffin → *Griffin*
- fn 32: Warner → *Warner*

Full-cite case names in citation sentences remain non-italicized per
traditional law-review white-page style (Bluebook Rule 10).

Co-Authored-By: Claude Sonnet 4.6 <noreply@anthropic.com>
</commit_message>
<xml_diff>
--- a/_paper/Slro_paper_final.docx
+++ b/_paper/Slro_paper_final.docx
@@ -1513,7 +1513,14 @@
         <w:t xml:space="preserve"> </w:t>
       </w:r>
       <w:r>
-        <w:t xml:space="preserve">Heppner, 2026 WL 436479.</w:t>
+        <w:rPr>
+          <w:i/>
+          <w:iCs/>
+        </w:rPr>
+        <w:t xml:space="preserve">Heppner</w:t>
+      </w:r>
+      <w:r>
+        <w:t xml:space="preserve">, 2026 WL 436479.</w:t>
       </w:r>
     </w:p>
   </w:footnote>
@@ -1561,7 +1568,14 @@
         <w:t xml:space="preserve"> </w:t>
       </w:r>
       <w:r>
-        <w:t xml:space="preserve">Warner, 2026 WL 373043.</w:t>
+        <w:rPr>
+          <w:i/>
+          <w:iCs/>
+        </w:rPr>
+        <w:t xml:space="preserve">Warner</w:t>
+      </w:r>
+      <w:r>
+        <w:t xml:space="preserve">, 2026 WL 373043.</w:t>
       </w:r>
     </w:p>
   </w:footnote>
@@ -1779,7 +1793,14 @@
         <w:t xml:space="preserve"> </w:t>
       </w:r>
       <w:r>
-        <w:t xml:space="preserve">Heppner, 2026 WL 436479, at *4 (no counsel direction, no protection)</w:t>
+        <w:rPr>
+          <w:i/>
+          <w:iCs/>
+        </w:rPr>
+        <w:t xml:space="preserve">Heppner</w:t>
+      </w:r>
+      <w:r>
+        <w:t xml:space="preserve">, 2026 WL 436479, at *4 (no counsel direction, no protection)</w:t>
       </w:r>
       <w:r>
         <w:t xml:space="preserve"> </w:t>
@@ -1795,7 +1816,14 @@
         <w:t xml:space="preserve"> </w:t>
       </w:r>
       <w:r>
-        <w:t xml:space="preserve">Warner, 2026 WL 373043, at *3 (self-represented party is own advocate, protection applies).</w:t>
+        <w:rPr>
+          <w:i/>
+          <w:iCs/>
+        </w:rPr>
+        <w:t xml:space="preserve">Warner</w:t>
+      </w:r>
+      <w:r>
+        <w:t xml:space="preserve">, 2026 WL 373043, at *3 (self-represented party is own advocate, protection applies).</w:t>
       </w:r>
     </w:p>
   </w:footnote>
@@ -2176,7 +2204,14 @@
         <w:t xml:space="preserve"> </w:t>
       </w:r>
       <w:r>
-        <w:t xml:space="preserve">Heppner, 2026 WL 436479, at *4 (citing the consumer AI platform's terms of service as a basis for finding no reasonable expectation of confidentiality).</w:t>
+        <w:rPr>
+          <w:i/>
+          <w:iCs/>
+        </w:rPr>
+        <w:t xml:space="preserve">Heppner</w:t>
+      </w:r>
+      <w:r>
+        <w:t xml:space="preserve">, 2026 WL 436479, at *4 (citing the consumer AI platform's terms of service as a basis for finding no reasonable expectation of confidentiality).</w:t>
       </w:r>
     </w:p>
   </w:footnote>
@@ -2469,7 +2504,20 @@
         <w:t xml:space="preserve"> </w:t>
       </w:r>
       <w:r>
-        <w:t xml:space="preserve">Gideon v. Wainwright, 372 U.S. 335 (1963); Faretta v. California, 422 U.S. 806 (1975); Griffin, 351 U.S. at 19.</w:t>
+        <w:t xml:space="preserve">Gideon v. Wainwright, 372 U.S. 335 (1963); Faretta v. California, 422 U.S. 806 (1975);</w:t>
+      </w:r>
+      <w:r>
+        <w:t xml:space="preserve"> </w:t>
+      </w:r>
+      <w:r>
+        <w:rPr>
+          <w:i/>
+          <w:iCs/>
+        </w:rPr>
+        <w:t xml:space="preserve">Griffin</w:t>
+      </w:r>
+      <w:r>
+        <w:t xml:space="preserve">, 351 U.S. at 19.</w:t>
       </w:r>
       <w:r>
         <w:t xml:space="preserve"> </w:t>
@@ -2931,7 +2979,14 @@
         <w:t xml:space="preserve"> </w:t>
       </w:r>
       <w:r>
-        <w:t xml:space="preserve">Warner, 2026 WL 373043, at *4 ("Generative AI programs are tools, not persons.").</w:t>
+        <w:rPr>
+          <w:i/>
+          <w:iCs/>
+        </w:rPr>
+        <w:t xml:space="preserve">Warner</w:t>
+      </w:r>
+      <w:r>
+        <w:t xml:space="preserve">, 2026 WL 373043, at *4 ("Generative AI programs are tools, not persons.").</w:t>
       </w:r>
     </w:p>
   </w:footnote>

</xml_diff>

<commit_message>
Remove all em-dashes; restructure with parens, colons, and commas
User request: remove every em-dash. 73 em-dashes in paper, 30 in
disclosure form, 7 in submission form answers — all replaced.

Bulk approach: em-dash → comma. Then targeted cleanup of 16 sentences
where comma replacement broke subject-verb structure or created
ambiguity. Most converted to:
- Parentheses (where em-dash held a list parenthetical: agents,
  models, persons, infrastructure, asymmetries, kernel, framework, etc.)
- Colons (where em-dash introduced an enumeration or punchline)
- Restructured sentences (Crime Victims Rights Act paragraph,
  computational inference clause)

Word count: ~5,300 markdown / ~4,000 in user's Word measurement.

Co-Authored-By: Claude Sonnet 4.6 <noreply@anthropic.com>
</commit_message>
<xml_diff>
--- a/_paper/Slro_paper_final.docx
+++ b/_paper/Slro_paper_final.docx
@@ -88,7 +88,7 @@
         <w:pStyle w:val="BodyText"/>
       </w:pPr>
       <w:r>
-        <w:t xml:space="preserve">This Essay argues that this fracture raises an underexamined civil rights problem. As artificial intelligence becomes a primary tool for legal preparation, access to protected legal reasoning increasingly depends on professional credential and platform tier rather than function. Because effective participation in legal processes—whether defending against criminal charges, seeking redress, or navigating administrative systems—requires the ability to prepare without compelled disclosure, the uneven protection of AI-assisted work risks entrenching structural inequality across the legal system. Individuals without access to counsel or enterprise-grade tools may be uniquely exposed, even as they rely most heavily on AI to exercise legal rights.</w:t>
+        <w:t xml:space="preserve">This Essay argues that this fracture raises an underexamined civil rights problem. As artificial intelligence becomes a primary tool for legal preparation, access to protected legal reasoning increasingly depends on professional credential and platform tier rather than function. Because effective participation in legal processes, whether defending against criminal charges, seeking redress, or navigating administrative systems, requires the ability to prepare without compelled disclosure, the uneven protection of AI-assisted work risks entrenching structural inequality across the legal system. Individuals without access to counsel or enterprise-grade tools may be uniquely exposed, even as they rely most heavily on AI to exercise legal rights.</w:t>
       </w:r>
     </w:p>
     <w:p>
@@ -133,7 +133,7 @@
         <w:t xml:space="preserve"> </w:t>
       </w:r>
       <w:r>
-        <w:t xml:space="preserve">The split is not a procedural anomaly. It is the first visible surface of a structural inequality forming inside AI-mediated legal systems. The question was whether materials a person created with the assistance of a publicly available AI platform—legal research, case analysis, strategic planning—are protected work product, or whether they are discoverable because the AI platform is not an attorney and its terms of service disclaim confidentiality. The answer, it turns out, depends on who the person is.</w:t>
+        <w:t xml:space="preserve">The split is not a procedural anomaly. It is the first visible surface of a structural inequality forming inside AI-mediated legal systems. The question was whether materials a person created with the assistance of a publicly available AI platform (legal research, case analysis, strategic planning) are protected work product, or whether they are discoverable because the AI platform is not an attorney and its terms of service disclaim confidentiality. The answer, it turns out, depends on who the person is.</w:t>
       </w:r>
     </w:p>
     <w:p>
@@ -166,7 +166,7 @@
         <w:t xml:space="preserve"> </w:t>
       </w:r>
       <w:r>
-        <w:t xml:space="preserve">Bradley Heppner, facing securities fraud charges, had used a consumer AI platform to create thirty-one documents containing defense strategies, factual analyses, and legal arguments. He did so without his attorney's direction. The court, applying what it called the "core" of the work-product doctrine—"shelter[ing] the mental processes of the attorney, providing a privileged area within which he can analyze and prepare his client's case"—found that materials created by a non-lawyer without attorney involvement fell outside the doctrine's shelter.</w:t>
+        <w:t xml:space="preserve">Bradley Heppner, facing securities fraud charges, had used a consumer AI platform to create thirty-one documents containing defense strategies, factual analyses, and legal arguments. He did so without his attorney's direction. The court, applying what it called the "core" of the work-product doctrine ("shelter[ing] the mental processes of the attorney, providing a privileged area within which he can analyze and prepare his client's case"), found that materials created by a non-lawyer without attorney involvement fell outside the doctrine's shelter.</w:t>
       </w:r>
       <w:r>
         <w:rPr>
@@ -214,7 +214,7 @@
         <w:t xml:space="preserve"> </w:t>
       </w:r>
       <w:r>
-        <w:t xml:space="preserve">Sohyon Warner, a pro se plaintiff in an employment discrimination case, had used consumer AI to prepare her case. When the defendants moved to compel production of all AI-related materials, the court denied the motion. Pro se litigants, it reasoned, occupy a unique dual role—"simultaneously the party and the advocate."</w:t>
+        <w:t xml:space="preserve">Sohyon Warner, a pro se plaintiff in an employment discrimination case, had used consumer AI to prepare her case. When the defendants moved to compel production of all AI-related materials, the court denied the motion. Pro se litigants, it reasoned, occupy a unique dual role: "simultaneously the party and the advocate."</w:t>
       </w:r>
       <w:r>
         <w:rPr>
@@ -311,7 +311,7 @@
         <w:pStyle w:val="BodyText"/>
       </w:pPr>
       <w:r>
-        <w:t xml:space="preserve">The emerging divide is not about whether AI is reliable, whether its outputs are accurate, or whether its use constitutes the unauthorized practice of law. It is about whether the protection of legal preparation—the ability to research, analyze, and strategize without surrendering that work to the opposing side—attaches to the nature of the work or the status of the person performing it. This Essay enters an empty field. Existing scholarship treats AI as a civil rights threat in employment, housing, and criminal sentencing contexts, but has not yet examined how AI's role in legal preparation itself implicates equal protection, procedural fairness, and access to courts. This Essay argues that the fracture reveals a structural inequality in the distribution of protected legal thought, one that AI has made visible and that civil rights law is uniquely positioned to address. At its most extreme, this fracture leaves crime victims—who are not parties to the criminal proceeding, not represented by the prosecutor, and not entitled to appointed counsel—with no work-product framework for their preparation at all. The core thesis is that work-product protection is increasingly determined by professional credential and subscription tier rather than by function, and that this development conditions the exercise of fundamental rights on status and access.</w:t>
+        <w:t xml:space="preserve">The emerging divide is not about whether AI is reliable, whether its outputs are accurate, or whether its use constitutes the unauthorized practice of law. It is about whether the protection of legal preparation (the ability to research, analyze, and strategize without surrendering that work to the opposing side) attaches to the nature of the work or the status of the person performing it. This Essay enters an empty field. Existing scholarship treats AI as a civil rights threat in employment, housing, and criminal sentencing contexts, but has not yet examined how AI's role in legal preparation itself implicates equal protection, procedural fairness, and access to courts. This Essay argues that the fracture reveals a structural inequality in the distribution of protected legal thought, one that AI has made visible and that civil rights law is uniquely positioned to address. At its most extreme, this fracture leaves crime victims, who are not parties to the criminal proceeding, not represented by the prosecutor, and not entitled to appointed counsel, with no work-product framework for their preparation at all. The core thesis is that work-product protection is increasingly determined by professional credential and subscription tier rather than by function, and that this development conditions the exercise of fundamental rights on status and access.</w:t>
       </w:r>
     </w:p>
     <w:p>
@@ -319,7 +319,7 @@
         <w:pStyle w:val="BodyText"/>
       </w:pPr>
       <w:r>
-        <w:t xml:space="preserve">The argument proceeds in six parts. Part II describes how AI has transformed access to legal capability without a corresponding expansion of protection. Part III examines the constitutional infrastructure—the technical, contractual, and institutional systems—that now mediates the protection of legal thought. Part IV anchors the fracture in civil rights law: equal protection, procedural fairness, and access to courts. Part V proposes a functional rule that would align protection with preparation rather than status. Part VI identifies materials—including a recently discovered conservation law—that make operational verification of protected preparation increasingly feasible. A brief conclusion returns to the civil rights stakes.</w:t>
+        <w:t xml:space="preserve">The argument proceeds in six parts. Part II describes how AI has transformed access to legal capability without a corresponding expansion of protection. Part III examines the constitutional infrastructure (the technical, contractual, and institutional systems) that now mediates the protection of legal thought. Part IV anchors the fracture in civil rights law: equal protection, procedural fairness, and access to courts. Part V proposes a functional rule that would align protection with preparation rather than status. Part VI identifies materials, including a recently discovered conservation law, that make operational verification of protected preparation increasingly feasible. A brief conclusion returns to the civil rights stakes.</w:t>
       </w:r>
     </w:p>
     <w:p>
@@ -372,7 +372,7 @@
         <w:t xml:space="preserve"> </w:t>
       </w:r>
       <w:r>
-        <w:t xml:space="preserve">At its core, the doctrine protects the mental impressions, strategies, and legal reasoning developed in anticipation of litigation—not merely the documents in which they are expressed. The historical justification for tying protection to attorney status was straightforward: only lawyers could generate the kind of legal analysis the doctrine was designed to shelter. The ability to perform attorney-quality legal work tracked the professional credential. Extending protection to the attorney's agents—paralegals, investigators, consultants—was a practical extension, not a theoretical challenge, because those agents operated under the attorney's direction. The system was credential-gated because the capability was credential-gated.</w:t>
+        <w:t xml:space="preserve">At its core, the doctrine protects the mental impressions, strategies, and legal reasoning developed in anticipation of litigation, not merely the documents in which they are expressed. The historical justification for tying protection to attorney status was straightforward: only lawyers could generate the kind of legal analysis the doctrine was designed to shelter. The ability to perform attorney-quality legal work tracked the professional credential. Extending protection to the attorney's agents (paralegals, investigators, consultants) was a practical extension, not a theoretical challenge, because those agents operated under the attorney's direction. The system was credential-gated because the capability was credential-gated.</w:t>
       </w:r>
     </w:p>
     <w:p>
@@ -392,7 +392,7 @@
         <w:t xml:space="preserve"> </w:t>
       </w:r>
       <w:r>
-        <w:t xml:space="preserve">This is not a speculative claim about future technology. It is the present reality for millions of individuals who navigate the legal system without counsel—pro se civil litigants, criminal defendants supplementing appointed counsel's work, administrative claimants, and crime victims preparing to engage with prosecutors.</w:t>
+        <w:t xml:space="preserve">This is not a speculative claim about future technology. It is the present reality for millions of individuals who navigate the legal system without counsel: pro se civil litigants, criminal defendants supplementing appointed counsel's work, administrative claimants, and crime victims preparing to engage with prosecutors.</w:t>
       </w:r>
       <w:r>
         <w:rPr>
@@ -406,7 +406,7 @@
         <w:pStyle w:val="BodyText"/>
       </w:pPr>
       <w:r>
-        <w:t xml:space="preserve">The collapse of the credential-to-capability link creates a civil rights gap. Effective participation in legal proceedings requires preparation, and preparation under threat of compelled disclosure is not meaningful preparation. If a person researching their legal rights knows that every query, every analysis, every drafted strategy can be demanded by the opposing side—while the opposing side's lawyer prepares in the shelter of work-product protection—the playing field is structurally tilted. The tilt does not arise from differences in the quality of the work. It arises from the asymmetry of protection.</w:t>
+        <w:t xml:space="preserve">The collapse of the credential-to-capability link creates a civil rights gap. Effective participation in legal proceedings requires preparation, and preparation under threat of compelled disclosure is not meaningful preparation. If a person researching their legal rights knows that every query, every analysis, every drafted strategy can be demanded by the opposing side (while the opposing side's lawyer prepares in the shelter of work-product protection), the playing field is structurally tilted. The tilt does not arise from differences in the quality of the work. It arises from the asymmetry of protection.</w:t>
       </w:r>
     </w:p>
     <w:p>
@@ -442,7 +442,7 @@
         <w:t xml:space="preserve"> </w:t>
       </w:r>
       <w:r>
-        <w:t xml:space="preserve">For represented parties acting outside that relationship, AI-assisted work is exposed. For self-represented parties, AI-assisted work may be sheltered. For crime victims—who are not parties, not represented by the prosecutor, and not self-represented litigants—no framework attaches at all.</w:t>
+        <w:t xml:space="preserve">For represented parties acting outside that relationship, AI-assisted work is exposed. For self-represented parties, AI-assisted work may be sheltered. For crime victims, who are not parties, not represented by the prosecutor, and not self-represented litigants, no framework attaches at all.</w:t>
       </w:r>
       <w:r>
         <w:rPr>
@@ -536,7 +536,7 @@
         <w:pStyle w:val="BodyText"/>
       </w:pPr>
       <w:r>
-        <w:t xml:space="preserve">Consumer versions of the same underlying models—Claude, ChatGPT, Gemini—are available for free or at modest monthly cost. They produce outputs of materially comparable analytical quality. But the legal profession's discourse, reinforced by</w:t>
+        <w:t xml:space="preserve">Consumer versions of the same underlying models (Claude, ChatGPT, Gemini) are available for free or at modest monthly cost. They produce outputs of materially comparable analytical quality. But the legal profession's discourse, reinforced by</w:t>
       </w:r>
       <w:r>
         <w:t xml:space="preserve"> </w:t>
@@ -605,7 +605,7 @@
         <w:t xml:space="preserve"> </w:t>
       </w:r>
       <w:r>
-        <w:t xml:space="preserve">The same model, accessed through the consumer platform by a non-attorney, produces output that is not protected—not because the work is different, but because the access tier identifies the user as a non-attorney.</w:t>
+        <w:t xml:space="preserve">The same model, accessed through the consumer platform by a non-attorney, produces output that is not protected, not because the work is different, but because the access tier identifies the user as a non-attorney.</w:t>
       </w:r>
     </w:p>
     <w:bookmarkEnd w:id="45"/>
@@ -694,7 +694,7 @@
         <w:pStyle w:val="FirstParagraph"/>
       </w:pPr>
       <w:r>
-        <w:t xml:space="preserve">Two persons preparing for litigation—one a lawyer through Harvey, the other a self-represented litigant through consumer AI—may produce materially comparable legal analysis. The lawyer's work is protected. The self-represented litigant's work, under</w:t>
+        <w:t xml:space="preserve">Two persons preparing for litigation (one a lawyer through Harvey, the other a self-represented litigant through consumer AI) may produce materially comparable legal analysis. The lawyer's work is protected. The self-represented litigant's work, under</w:t>
       </w:r>
       <w:r>
         <w:t xml:space="preserve"> </w:t>
@@ -731,7 +731,7 @@
         <w:t xml:space="preserve"> </w:t>
       </w:r>
       <w:r>
-        <w:t xml:space="preserve">itself recognized that conditioning AI work-product protection on attorney involvement "would further disadvantage unrepresented litigants"—the precise distributive consequence that civil rights scrutiny exists to address.</w:t>
+        <w:t xml:space="preserve">itself recognized that conditioning AI work-product protection on attorney involvement "would further disadvantage unrepresented litigants": the precise distributive consequence that civil rights scrutiny exists to address.</w:t>
       </w:r>
       <w:r>
         <w:rPr>
@@ -743,7 +743,7 @@
         <w:t xml:space="preserve"> </w:t>
       </w:r>
       <w:r>
-        <w:t xml:space="preserve">The historical justification for credential-based asymmetry—that lawyers had unique analytical capacity—collapses when the same AI model generates materially comparable analysis for both. When function detaches from credential, a doctrine that ties protection to credential tracks status, not function. That classification, when it burdens the population least able to afford the alternative, is one that civil rights law has reason to scrutinize.</w:t>
+        <w:t xml:space="preserve">The historical justification for credential-based asymmetry, that lawyers had unique analytical capacity, collapses when the same AI model generates materially comparable analysis for both. When function detaches from credential, a doctrine that ties protection to credential tracks status, not function. That classification, when it burdens the population least able to afford the alternative, is one that civil rights law has reason to scrutinize.</w:t>
       </w:r>
     </w:p>
     <w:p>
@@ -790,7 +790,7 @@
         <w:t xml:space="preserve">Faretta v. California</w:t>
       </w:r>
       <w:r>
-        <w:t xml:space="preserve">. Each of those doctrines recognizes that the right itself is hollow without the conditions that make its exercise possible. A doctrine that conditions the ability to prepare—to think legally in private—is functionally part of the right itself, not an adjunct to it. Griffin's principle—that "there can be no equal justice where the kind of trial a man gets depends on the amount of money he has"—applies directly when what determines that access is subscription tier rather than financial means per se. The inequality is the same. Only the mechanism has changed.</w:t>
+        <w:t xml:space="preserve">. Each of those doctrines recognizes that the right itself is hollow without the conditions that make its exercise possible. A doctrine that conditions the ability to prepare, to think legally in private, is functionally part of the right itself, not an adjunct to it. Griffin's principle, that "there can be no equal justice where the kind of trial a man gets depends on the amount of money he has", applies directly when what determines that access is subscription tier rather than financial means per se. The inequality is the same. Only the mechanism has changed.</w:t>
       </w:r>
       <w:r>
         <w:rPr>
@@ -814,7 +814,7 @@
         <w:pStyle w:val="FirstParagraph"/>
       </w:pPr>
       <w:r>
-        <w:t xml:space="preserve">The collection's framing of procedural fairness is directly implicated. Preparation exposure is procedural disadvantage. When one party prepares under shelter—knowing their research, analysis, and strategy cannot be compelled—and another party prepares under threat of discovery for performing the identical function, the proceeding is not procedurally fair. The disadvantage is not in the quality of the analysis; it is in the safety of the process.</w:t>
+        <w:t xml:space="preserve">The collection's framing of procedural fairness is directly implicated. Preparation exposure is procedural disadvantage. When one party prepares under shelter (knowing their research, analysis, and strategy cannot be compelled) and another party prepares under threat of discovery for performing the identical function, the proceeding is not procedurally fair. The disadvantage is not in the quality of the analysis; it is in the safety of the process.</w:t>
       </w:r>
       <w:r>
         <w:rPr>
@@ -947,7 +947,7 @@
         <w:pStyle w:val="BodyText"/>
       </w:pPr>
       <w:r>
-        <w:t xml:space="preserve">The fracture extends into every domain where individuals must prepare to exercise legal rights without the shelter of counsel. Civil rights law has addressed analogous structural asymmetries—discriminatory hiring tools, automated benefits denials, proxy discrimination in lending—by identifying the ways technically neutral rules produce systematically unequal outcomes.</w:t>
+        <w:t xml:space="preserve">The fracture extends into every domain where individuals must prepare to exercise legal rights without the shelter of counsel. Civil rights law has addressed analogous structural asymmetries (discriminatory hiring tools, automated benefits denials, proxy discrimination in lending) by identifying the ways technically neutral rules produce systematically unequal outcomes.</w:t>
       </w:r>
       <w:r>
         <w:rPr>
@@ -993,7 +993,7 @@
         <w:pStyle w:val="BodyText"/>
       </w:pPr>
       <w:r>
-        <w:t xml:space="preserve">The proposed rule is functional. Work-product protection should attach to the nature of legal preparation in anticipation of litigation or legal proceedings, not to the professional identity of the preparer or the technological channel through which the work is produced. AI-assisted material retains protection when prepared in anticipation of proceedings, unless the proponent demonstrates actual adversarially relevant exposure—beyond ordinary computational processing.</w:t>
+        <w:t xml:space="preserve">The proposed rule is functional. Work-product protection should attach to the nature of legal preparation in anticipation of litigation or legal proceedings, not to the professional identity of the preparer or the technological channel through which the work is produced. AI-assisted material retains protection when prepared in anticipation of proceedings, unless the proponent demonstrates actual adversarially relevant exposure beyond ordinary computational processing.</w:t>
       </w:r>
       <w:r>
         <w:rPr>
@@ -1032,7 +1032,7 @@
         <w:pStyle w:val="BodyText"/>
       </w:pPr>
       <w:r>
-        <w:t xml:space="preserve">The doctrine that work-product protection incentivizes the attorney-client relationship serves important values—competence, ethics regulation, professional accountability. However, that incentive argument has no force in the circumstances this rule addresses: where counsel is unavailable or unaffordable, and the alternative is no preparation at all. The functional rule protects preparation in the gap, not in place of counsel.</w:t>
+        <w:t xml:space="preserve">The doctrine that work-product protection incentivizes the attorney-client relationship serves important values: competence, ethics regulation, professional accountability. However, that incentive argument has no force in the circumstances this rule addresses: where counsel is unavailable or unaffordable, and the alternative is no preparation at all. The functional rule protects preparation in the gap, not in place of counsel.</w:t>
       </w:r>
     </w:p>
     <w:p>
@@ -1068,7 +1068,7 @@
         <w:t xml:space="preserve"> </w:t>
       </w:r>
       <w:r>
-        <w:t xml:space="preserve">The objection is misplaced. The functional rule does not protect AI output as algorithmic product; it protects the human preparation activity—the prompts, the directional choices, the integration of output into a litigation strategy—that embeds the preparer's mental impressions as surely as a paralegal's research memorandum does. The copyright analogy under</w:t>
+        <w:t xml:space="preserve">The objection is misplaced. The functional rule does not protect AI output as algorithmic product; it protects the human preparation activity (the prompts, the directional choices, the integration of output into a litigation strategy) that embeds the preparer's mental impressions as surely as a paralegal's research memorandum does. The copyright analogy under</w:t>
       </w:r>
       <w:r>
         <w:t xml:space="preserve"> </w:t>
@@ -1120,7 +1120,7 @@
         <w:t xml:space="preserve"> </w:t>
       </w:r>
       <w:r>
-        <w:t xml:space="preserve">The legally relevant events are onward sharing, human review by platform staff, government subpoena of stored data, or actual adversarial access—not the computational inference itself. Treating the potential for future training or data retention as an immediate waiver of protection is equivalent to saying that an email provider's ability to scan messages for spam waives attorney-client privilege over the scanned communications. The doctrine does not require that result, and courts should not adopt it.</w:t>
+        <w:t xml:space="preserve">The legally relevant events are onward sharing, human review by platform staff, government subpoena of stored data, or actual adversarial access; the computational inference itself is not such an event. Treating the potential for future training or data retention as an immediate waiver of protection is equivalent to saying that an email provider's ability to scan messages for spam waives attorney-client privilege over the scanned communications. The doctrine does not require that result, and courts should not adopt it.</w:t>
       </w:r>
     </w:p>
     <w:p>
@@ -1166,7 +1166,7 @@
         <w:t xml:space="preserve"> </w:t>
       </w:r>
       <w:r>
-        <w:t xml:space="preserve">already take this path. Extending it to all persons preparing in anticipation of litigation—regardless of whether they are represented, self-represented, or preparing to participate as a crime victim in a criminal proceeding—is a doctrinal development, not a statutory amendment.</w:t>
+        <w:t xml:space="preserve">already take this path. Extending it to all persons preparing in anticipation of litigation, regardless of whether they are represented, self-represented, or preparing to participate as a crime victim in a criminal proceeding, is a doctrinal development, not a statutory amendment.</w:t>
       </w:r>
     </w:p>
     <w:p>
@@ -1206,7 +1206,7 @@
         <w:t xml:space="preserve"> </w:t>
       </w:r>
       <w:r>
-        <w:t xml:space="preserve">have begun to do. Rulemaking can amend the Federal Rules of Civil Procedure and parallel state rules to explicitly extend protection to AI-assisted preparation by self-represented parties and by parties preparing for any legal proceeding, regardless of platform tier. And legislation can address the specific gaps—for example, targeted amendments to the Crime Victims' Rights Act</w:t>
+        <w:t xml:space="preserve">have begun to do. Rulemaking can amend the Federal Rules of Civil Procedure and parallel state rules to explicitly extend protection to AI-assisted preparation by self-represented parties and by parties preparing for any legal proceeding, regardless of platform tier. And legislation can address the specific gaps. For example, targeted amendments to the Crime Victims' Rights Act</w:t>
       </w:r>
       <w:r>
         <w:rPr>
@@ -1218,7 +1218,7 @@
         <w:t xml:space="preserve"> </w:t>
       </w:r>
       <w:r>
-        <w:t xml:space="preserve">or model provisions for state victims' rights campaigns—to ensure that crime victims' AI-assisted preparation materials are not discoverable by the very defendants whose conduct they are documenting.</w:t>
+        <w:t xml:space="preserve">or model provisions for state victims' rights campaigns can ensure that crime victims' AI-assisted preparation materials are not discoverable by the very defendants whose conduct they are documenting.</w:t>
       </w:r>
       <w:r>
         <w:rPr>
@@ -1257,7 +1257,7 @@
         <w:pStyle w:val="FirstParagraph"/>
       </w:pPr>
       <w:r>
-        <w:t xml:space="preserve">A doctrinal rule is necessary but not itself sufficient. To be operational, a rule that protects AI-assisted legal preparation requires the capacity to verify that the protection has been preserved—that the preparation was conducted in confidence and that its protected character survived the technological pipeline. The infrastructure for that verification is beginning to emerge.</w:t>
+        <w:t xml:space="preserve">A doctrinal rule is necessary but not itself sufficient. To be operational, a rule that protects AI-assisted legal preparation requires the capacity to verify that the protection has been preserved: that the preparation was conducted in confidence and that its protected character survived the technological pipeline. The infrastructure for that verification is beginning to emerge.</w:t>
       </w:r>
     </w:p>
     <w:p>
@@ -1277,7 +1277,7 @@
         <w:t xml:space="preserve"> </w:t>
       </w:r>
       <w:r>
-        <w:t xml:space="preserve">The Conservation Law of Commitment establishes that under governed conditions, the commitment kernel of a signal—its obligations, prohibitions, permissions, and constraints—is conserved; under ungoverned conditions, it decays in predictable, measurable ways. The law is substrate-agnostic. It applies to human transformation, AI transformation, and any hybrid.</w:t>
+        <w:t xml:space="preserve">The Conservation Law of Commitment establishes that under governed conditions, the commitment kernel of a signal (its obligations, prohibitions, permissions, and constraints) is conserved; under ungoverned conditions, it decays in predictable, measurable ways. The law is substrate-agnostic. It applies to human transformation, AI transformation, and any hybrid.</w:t>
       </w:r>
     </w:p>
     <w:p>
@@ -1285,7 +1285,7 @@
         <w:pStyle w:val="BodyText"/>
       </w:pPr>
       <w:r>
-        <w:t xml:space="preserve">Applying that framework to the work-product context—defining the kernel as "sheltered preparation in anticipation of proceedings" and implementing governed transformation protocols—would make the functional rule's protection demonstrable, not merely doctrinal. A person preparing for litigation could demonstrate not only that they intended their work to be confidential but that the confidentiality was structurally preserved—through cryptographic lineage, fidelity verification gates, and recursion testing.</w:t>
+        <w:t xml:space="preserve">Applying that framework to the work-product context (defining the kernel as "sheltered preparation in anticipation of proceedings" and implementing governed transformation protocols) would make the functional rule's protection demonstrable, not merely doctrinal. A person preparing for litigation could demonstrate not only that they intended their work to be confidential but that the confidentiality was structurally preserved through cryptographic lineage, fidelity verification gates, and recursion testing.</w:t>
       </w:r>
       <w:r>
         <w:rPr>
@@ -1351,7 +1351,7 @@
         <w:pStyle w:val="BodyText"/>
       </w:pPr>
       <w:r>
-        <w:t xml:space="preserve">This Essay does not ask courts to adopt any particular technical architecture. It argues only that verifiable preservation of confidentiality and legal meaning is becoming possible—and that the functional rule proposed here is designed to take advantage of that possibility as it matures.</w:t>
+        <w:t xml:space="preserve">This Essay does not ask courts to adopt any particular technical architecture. It argues only that verifiable preservation of confidentiality and legal meaning is becoming possible, and that the functional rule proposed here is designed to take advantage of that possibility as it matures.</w:t>
       </w:r>
     </w:p>
     <w:p>
@@ -1376,7 +1376,7 @@
         <w:pStyle w:val="FirstParagraph"/>
       </w:pPr>
       <w:r>
-        <w:t xml:space="preserve">The civil rights project has always been about identifying the ways law formally grants equality while practically permitting inequality to persist through structural arrangements. The AI work-product fracture is one of those arrangements. Courts have not consciously decided to create a two-tier system of protected legal thought. They have done so inadvertently, by applying a doctrine designed for the pre-AI world to a world in which the factual predicate of that doctrine—that legal analytical capability tracks professional credential—has collapsed.</w:t>
+        <w:t xml:space="preserve">The civil rights project has always been about identifying the ways law formally grants equality while practically permitting inequality to persist through structural arrangements. The AI work-product fracture is one of those arrangements. Courts have not consciously decided to create a two-tier system of protected legal thought. They have done so inadvertently, by applying a doctrine designed for the pre-AI world to a world in which the factual predicate of that doctrine, that legal analytical capability tracks professional credential, has collapsed.</w:t>
       </w:r>
     </w:p>
     <w:p>
@@ -1392,7 +1392,7 @@
         <w:pStyle w:val="BodyText"/>
       </w:pPr>
       <w:r>
-        <w:t xml:space="preserve">Artificial intelligence is reshaping how individuals prepare to assert and defend their rights. Civil rights law is at an inflection point—courts are narrowing antidiscrimination doctrine, rethinking protected classes, and grappling with technologically mediated harm in every domain. The work-product fracture belongs in that conversation. As AI becomes the primary tool through which unrepresented individuals access the legal system, civil rights law must confront a new question: not only who is protected, but whose legal thought is allowed to remain protected at all.</w:t>
+        <w:t xml:space="preserve">Artificial intelligence is reshaping how individuals prepare to assert and defend their rights. Civil rights law is at an inflection point, courts are narrowing antidiscrimination doctrine, rethinking protected classes, and grappling with technologically mediated harm in every domain. The work-product fracture belongs in that conversation. As AI becomes the primary tool through which unrepresented individuals access the legal system, civil rights law must confront a new question: not only who is protected, but whose legal thought is allowed to remain protected at all.</w:t>
       </w:r>
     </w:p>
     <w:p>

</xml_diff>

<commit_message>
Regenerate .docx with Times New Roman font
Pandoc's default reference template now uses Aptos (Microsoft Word's
2024+ default). Built a custom reference.docx with Times New Roman
substituted in theme1.xml and styles.xml, then regenerated the .docx
using --reference-doc.

Verified: theme1.xml now declares Times New Roman as the major and
minor Latin typeface throughout. Body, headings, and footnotes all
inherit TNR.

Co-Authored-By: Claude Sonnet 4.6 <noreply@anthropic.com>
</commit_message>
<xml_diff>
--- a/_paper/Slro_paper_final.docx
+++ b/_paper/Slro_paper_final.docx
@@ -4277,7 +4277,7 @@
     </a:clrScheme>
     <a:fontScheme name="Office">
       <a:majorFont>
-        <a:latin typeface="Aptos Display" panose="02110004020202020204"/>
+        <a:latin typeface="Times New Roman" panose="02110004020202020204"/>
         <a:ea typeface=""/>
         <a:cs typeface=""/>
         <a:font script="Jpan" typeface="游ゴシック Light"/>
@@ -4310,7 +4310,7 @@
         <a:font script="Viet" typeface="Times New Roman"/>
         <a:font script="Uigh" typeface="Microsoft Uighur"/>
         <a:font script="Geor" typeface="Sylfaen"/>
-        <a:font script="Armn" typeface="Arial"/>
+        <a:font script="Armn" typeface="Times New Roman"/>
         <a:font script="Bugi" typeface="Leelawadee UI"/>
         <a:font script="Bopo" typeface="Microsoft JhengHei"/>
         <a:font script="Java" typeface="Javanese Text"/>
@@ -4329,15 +4329,15 @@
         <a:font script="Tfng" typeface="Ebrima"/>
       </a:majorFont>
       <a:minorFont>
-        <a:latin typeface="Aptos" panose="02110004020202020204"/>
+        <a:latin typeface="Times New Roman" panose="02110004020202020204"/>
         <a:ea typeface=""/>
         <a:cs typeface=""/>
         <a:font script="Jpan" typeface="游明朝"/>
         <a:font script="Hang" typeface="맑은 고딕"/>
         <a:font script="Hans" typeface="等线"/>
         <a:font script="Hant" typeface="新細明體"/>
-        <a:font script="Arab" typeface="Arial"/>
-        <a:font script="Hebr" typeface="Arial"/>
+        <a:font script="Arab" typeface="Times New Roman"/>
+        <a:font script="Hebr" typeface="Times New Roman"/>
         <a:font script="Thai" typeface="Cordia New"/>
         <a:font script="Ethi" typeface="Nyala"/>
         <a:font script="Beng" typeface="Vrinda"/>
@@ -4359,10 +4359,10 @@
         <a:font script="Laoo" typeface="DokChampa"/>
         <a:font script="Sinh" typeface="Iskoola Pota"/>
         <a:font script="Mong" typeface="Mongolian Baiti"/>
-        <a:font script="Viet" typeface="Arial"/>
+        <a:font script="Viet" typeface="Times New Roman"/>
         <a:font script="Uigh" typeface="Microsoft Uighur"/>
         <a:font script="Geor" typeface="Sylfaen"/>
-        <a:font script="Armn" typeface="Arial"/>
+        <a:font script="Armn" typeface="Times New Roman"/>
         <a:font script="Bugi" typeface="Leelawadee UI"/>
         <a:font script="Bopo" typeface="Microsoft JhengHei"/>
         <a:font script="Java" typeface="Javanese Text"/>

</xml_diff>

<commit_message>
Personal opening edits: reframe Part I opener + tighten Abstract
Per personaledits.md:

Part I (Introduction) — reframed opening direction. Old version led with
"the split is not a procedural anomaly" framing. New version pivots
around "that day marked the beginning of a divide" and closes with the
historicizing frame: "This is not a new narrative. Every transformative
technology has outpaced the doctrinal categories that govern it; AI
introduces a new kind of variation that the system has not yet accounted
for. It is not failure. It is a new condition requiring new
infrastructure."

Abstract para 2 — tightened from a 4-sentence run-on into 4 cleaner
sentences. Removed "underexamined" (preview of empty-field claim later).
Reordered final sentence so the punch lands on "people without counsel."

Net word delta: ~-5 words. .docx regenerated with TNR template.

Co-Authored-By: Claude Sonnet 4.6 <noreply@anthropic.com>
</commit_message>
<xml_diff>
--- a/_paper/Slro_paper_final.docx
+++ b/_paper/Slro_paper_final.docx
@@ -88,7 +88,7 @@
         <w:pStyle w:val="BodyText"/>
       </w:pPr>
       <w:r>
-        <w:t xml:space="preserve">This Essay argues that this fracture raises an underexamined civil rights problem. As artificial intelligence becomes a primary tool for legal preparation, access to protected legal reasoning increasingly depends on professional credential and platform tier rather than function. Because effective participation in legal processes, whether defending against criminal charges, seeking redress, or navigating administrative systems, requires the ability to prepare without compelled disclosure, the uneven protection of AI-assisted work risks entrenching structural inequality across the legal system. Individuals without access to counsel or enterprise-grade tools may be uniquely exposed, even as they rely most heavily on AI to exercise legal rights.</w:t>
+        <w:t xml:space="preserve">This Essay argues that the fracture raises a civil rights problem. As AI becomes a primary tool for legal preparation, access to protected legal reasoning increasingly tracks professional credential and platform tier rather than function. Effective participation in legal proceedings requires the ability to prepare without compelled disclosure; the uneven protection of AI-assisted work entrenches structural inequality. The most exposed are precisely those who rely on AI most heavily to exercise legal rights: people without counsel and without access to enterprise-grade tools.</w:t>
       </w:r>
     </w:p>
     <w:p>
@@ -133,7 +133,7 @@
         <w:t xml:space="preserve"> </w:t>
       </w:r>
       <w:r>
-        <w:t xml:space="preserve">The split is not a procedural anomaly. It is the first visible surface of a structural inequality forming inside AI-mediated legal systems. The question was whether materials a person created with the assistance of a publicly available AI platform (legal research, case analysis, strategic planning) are protected work product, or whether they are discoverable because the AI platform is not an attorney and its terms of service disclaim confidentiality. The answer, it turns out, depends on who the person is.</w:t>
+        <w:t xml:space="preserve">That day marked the beginning of a divide over whether AI-assisted legal preparation is protected work product. The question was whether materials a person created with the assistance of a publicly available AI platform (legal research, case analysis, strategic planning) are protected work product, or whether they are discoverable because the AI platform is not an attorney and its terms of service disclaim confidentiality. The answer, it turns out, depends on who the person is. This is not a new narrative. Every transformative technology has outpaced the doctrinal categories that govern it; AI introduces a new kind of variation that the system has not yet accounted for. It is not failure. It is a new condition requiring new infrastructure.</w:t>
       </w:r>
     </w:p>
     <w:p>

</xml_diff>

<commit_message>
Two precision edits: "Within days of each other" + "doctrinal failure"
1. "On the same day" → "Within days of each other" — safer phrasing
   that avoids any factual-attack risk over the Heppner Feb 10 bench
   ruling vs. Feb 17 written opinion.

2. "It is not failure" → "It is not doctrinal failure" — cleaner legal
   register.

Co-Authored-By: Claude Sonnet 4.6 <noreply@anthropic.com>
</commit_message>
<xml_diff>
--- a/_paper/Slro_paper_final.docx
+++ b/_paper/Slro_paper_final.docx
@@ -133,7 +133,7 @@
         <w:t xml:space="preserve"> </w:t>
       </w:r>
       <w:r>
-        <w:t xml:space="preserve">That day marked the beginning of a divide over whether AI-assisted legal preparation is protected work product. The question was whether materials a person created with the assistance of a publicly available AI platform (legal research, case analysis, strategic planning) are protected work product, or whether they are discoverable because the AI platform is not an attorney and its terms of service disclaim confidentiality. The answer, it turns out, depends on who the person is. This is not a new narrative. Every transformative technology has outpaced the doctrinal categories that govern it; AI introduces a new kind of variation that the system has not yet accounted for. It is not failure. It is a new condition requiring new infrastructure.</w:t>
+        <w:t xml:space="preserve">That day marked the beginning of a divide over whether AI-assisted legal preparation is protected work product. The question was whether materials a person created with the assistance of a publicly available AI platform (legal research, case analysis, strategic planning) are protected work product, or whether they are discoverable because the AI platform is not an attorney and its terms of service disclaim confidentiality. The answer, it turns out, depends on who the person is. This is not a new narrative. Every transformative technology has outpaced the doctrinal categories that govern it; AI introduces a new kind of variation that the system has not yet accounted for. It is not doctrinal failure. It is a new condition requiring new infrastructure.</w:t>
       </w:r>
     </w:p>
     <w:p>
@@ -186,7 +186,7 @@
         <w:pStyle w:val="BodyText"/>
       </w:pPr>
       <w:r>
-        <w:t xml:space="preserve">On the same day, in the Eastern District of Michigan,</w:t>
+        <w:t xml:space="preserve">Within days of each other, in the Eastern District of Michigan,</w:t>
       </w:r>
       <w:r>
         <w:t xml:space="preserve"> </w:t>

</xml_diff>

<commit_message>
User manual edits: tighten opening + abstract; rebuild all outputs
User-applied edits to Slro_paper_final.md:
- Opening paragraph (Part I) reframed and condensed; em-dashes
  selectively reintroduced for parenthetical setoff in body
- Roadmap paragraph rewritten in flowing prose rather than enumerated
  parts (II/III/IV/V/VI/conclusion → "the next part... the one after
  that... from there... a functional rule follows...")
- Abstract para 2 trimmed to drop "This Essay argues" lead-in
- Abstract para 3 collapsed dual-sense civil rights definition into a
  single em-dash construction
- Part II opening tightened
- Various other manual prose tightening throughout

Rebuilt: .tex, .pdf, .docx (TNR reference template).

Co-Authored-By: Claude Sonnet 4.6 <noreply@anthropic.com>
</commit_message>
<xml_diff>
--- a/_paper/Slro_paper_final.docx
+++ b/_paper/Slro_paper_final.docx
@@ -88,7 +88,7 @@
         <w:pStyle w:val="BodyText"/>
       </w:pPr>
       <w:r>
-        <w:t xml:space="preserve">This Essay argues that the fracture raises a civil rights problem. As AI becomes a primary tool for legal preparation, access to protected legal reasoning increasingly tracks professional credential and platform tier rather than function. Effective participation in legal proceedings requires the ability to prepare without compelled disclosure; the uneven protection of AI-assisted work entrenches structural inequality. The most exposed are precisely those who rely on AI most heavily to exercise legal rights: people without counsel and without access to enterprise-grade tools.</w:t>
+        <w:t xml:space="preserve">The fracture raises a civil rights problem. As AI becomes a primary tool for legal preparation, access to protected legal reasoning increasingly tracks professional credential and platform tier rather than function. Effective participation in legal proceedings requires the ability to prepare without compelled disclosure, and the uneven protection of AI-assisted work entrenches structural inequality. The most exposed are the people who rely on AI most heavily to exercise legal rights: litigants without counsel and without access to enterprise-grade tools.</w:t>
       </w:r>
     </w:p>
     <w:p>
@@ -96,7 +96,7 @@
         <w:pStyle w:val="BodyText"/>
       </w:pPr>
       <w:r>
-        <w:t xml:space="preserve">This Essay contends that this emerging regime implicates core concerns of civil rights law, including equal protection, procedural fairness, and meaningful access to legal institutions. By "civil rights" this Essay means both the constitutional guarantees of equal protection, due process, and access to courts, and the broader civil rights tradition of identifying structural arrangements that perpetuate inequality even when formal legal equality exists. It proposes a functional rule: work product protection should attach to the nature of legal preparation in anticipation of proceedings, not the professional identity of the preparer or the technological channel through which the work is produced.</w:t>
+        <w:t xml:space="preserve">This emerging regime implicates core concerns of civil rights law: equal protection, procedural fairness, and meaningful access to legal institutions. The term carries both senses in this Essay — the constitutional guarantees of equal protection, due process, and access to courts, and the broader tradition of identifying structural arrangements that perpetuate inequality even where formal legal equality exists. The rule that follows is functional: work-product protection should attach to the nature of legal preparation in anticipation of proceedings, not to the professional identity of the preparer or the technological channel through which the work is produced.</w:t>
       </w:r>
     </w:p>
     <w:p>
@@ -133,7 +133,7 @@
         <w:t xml:space="preserve"> </w:t>
       </w:r>
       <w:r>
-        <w:t xml:space="preserve">That day marked the beginning of a divide over whether AI-assisted legal preparation is protected work product. The question was whether materials a person created with the assistance of a publicly available AI platform (legal research, case analysis, strategic planning) are protected work product, or whether they are discoverable because the AI platform is not an attorney and its terms of service disclaim confidentiality. The answer, it turns out, depends on who the person is. This is not a new narrative. Every transformative technology has outpaced the doctrinal categories that govern it; AI introduces a new kind of variation that the system has not yet accounted for. It is not doctrinal failure. It is a new condition requiring new infrastructure.</w:t>
+        <w:t xml:space="preserve">The question was whether materials a person prepared with the help of a publicly available AI platform — legal research, case analysis, strategic planning — are protected work product, or whether they are discoverable because the AI platform is not an attorney and its terms of service disclaim confidentiality. The answer, it turns out, depends on who the person is. Every transformative technology eventually outruns the doctrinal categories that govern it. AI is doing that now, and the variation it introduces is less a doctrinal failure than a condition the system has not yet built infrastructure for.</w:t>
       </w:r>
     </w:p>
     <w:p>
@@ -311,7 +311,7 @@
         <w:pStyle w:val="BodyText"/>
       </w:pPr>
       <w:r>
-        <w:t xml:space="preserve">The emerging divide is not about whether AI is reliable, whether its outputs are accurate, or whether its use constitutes the unauthorized practice of law. It is about whether the protection of legal preparation (the ability to research, analyze, and strategize without surrendering that work to the opposing side) attaches to the nature of the work or the status of the person performing it. This Essay enters an empty field. Existing scholarship treats AI as a civil rights threat in employment, housing, and criminal sentencing contexts, but has not yet examined how AI's role in legal preparation itself implicates equal protection, procedural fairness, and access to courts. This Essay argues that the fracture reveals a structural inequality in the distribution of protected legal thought, one that AI has made visible and that civil rights law is uniquely positioned to address. At its most extreme, this fracture leaves crime victims, who are not parties to the criminal proceeding, not represented by the prosecutor, and not entitled to appointed counsel, with no work-product framework for their preparation at all. The core thesis is that work-product protection is increasingly determined by professional credential and subscription tier rather than by function, and that this development conditions the exercise of fundamental rights on status and access.</w:t>
+        <w:t xml:space="preserve">The emerging divide is not about whether AI is reliable, whether its outputs are accurate, or whether its use constitutes the unauthorized practice of law. It is about whether the protection of legal preparation — the ability to research, analyze, and strategize without surrendering that work to the opposing side — attaches to the nature of the work or to the status of the person doing it. Existing scholarship treats AI as a civil rights threat in employment, housing, and criminal sentencing, but has not yet examined how AI's role in legal preparation itself implicates equal treatment, fair procedure, and access to the courts. What the split reveals is a structural inequality in the distribution of protected legal thought, one that AI has made visible and that civil rights law is positioned to address. At its sharpest edge, the gap leaves crime victims — who are not parties to the criminal proceeding, not represented by the prosecutor, and not entitled to appointed counsel — with no work-product framework for their preparation at all. The core thesis follows: work-product protection is increasingly determined by professional credential and subscription tier rather than by function, and that arrangement conditions the exercise of fundamental rights on status and access.</w:t>
       </w:r>
     </w:p>
     <w:p>
@@ -319,7 +319,7 @@
         <w:pStyle w:val="BodyText"/>
       </w:pPr>
       <w:r>
-        <w:t xml:space="preserve">The argument proceeds in six parts. Part II describes how AI has transformed access to legal capability without a corresponding expansion of protection. Part III examines the constitutional infrastructure (the technical, contractual, and institutional systems) that now mediates the protection of legal thought. Part IV anchors the fracture in civil rights law: equal protection, procedural fairness, and access to courts. Part V proposes a functional rule that would align protection with preparation rather than status. Part VI identifies materials, including a recently discovered conservation law, that make operational verification of protected preparation increasingly feasible. A brief conclusion returns to the civil rights stakes.</w:t>
+        <w:t xml:space="preserve">The argument tracks that thesis in stages. The next part shows how AI broke the credential-to-capability link the doctrine assumed; the one after that maps the contractual and institutional architecture that has stepped in to do the gatekeeping the credential used to do. From there, the asymmetry sits inside civil rights law, where it implicates equal treatment, procedural fairness, and access to the courts. A functional rule follows, with verification infrastructure — including a recently discovered conservation law — that the rule can rely on. A short conclusion returns to the stakes.</w:t>
       </w:r>
     </w:p>
     <w:p>
@@ -344,7 +344,7 @@
         <w:pStyle w:val="FirstParagraph"/>
       </w:pPr>
       <w:r>
-        <w:t xml:space="preserve">Work-product doctrine rests on a factual predicate that AI has destroyed. The doctrine, recognized in</w:t>
+        <w:t xml:space="preserve">Work-product doctrine rests on a factual predicate that AI has destroyed. Recognized in</w:t>
       </w:r>
       <w:r>
         <w:t xml:space="preserve"> </w:t>
@@ -360,7 +360,7 @@
         <w:t xml:space="preserve"> </w:t>
       </w:r>
       <w:r>
-        <w:t xml:space="preserve">and codified in Federal Rule of Civil Procedure 26(b)(3), protects "documents and tangible things that are prepared in anticipation of litigation or for trial by or for another party or its representative."</w:t>
+        <w:t xml:space="preserve">and codified in Federal Rule of Civil Procedure 26(b)(3), the doctrine protects "documents and tangible things that are prepared in anticipation of litigation or for trial by or for another party or its representative."</w:t>
       </w:r>
       <w:r>
         <w:rPr>
@@ -372,7 +372,7 @@
         <w:t xml:space="preserve"> </w:t>
       </w:r>
       <w:r>
-        <w:t xml:space="preserve">At its core, the doctrine protects the mental impressions, strategies, and legal reasoning developed in anticipation of litigation, not merely the documents in which they are expressed. The historical justification for tying protection to attorney status was straightforward: only lawyers could generate the kind of legal analysis the doctrine was designed to shelter. The ability to perform attorney-quality legal work tracked the professional credential. Extending protection to the attorney's agents (paralegals, investigators, consultants) was a practical extension, not a theoretical challenge, because those agents operated under the attorney's direction. The system was credential-gated because the capability was credential-gated.</w:t>
+        <w:t xml:space="preserve">At its core it shelters the mental impressions, strategies, and legal reasoning developed in anticipation of litigation, not merely the documents in which they are expressed. Tying protection to attorney status had a simple justification: only lawyers could generate the kind of legal analysis the doctrine was designed to shelter. Attorney-quality legal work tracked the professional credential, and extending protection to the attorney's agents — paralegals, investigators, consultants — was a practical extension, not a theoretical challenge, because those agents operated under the attorney's direction. The system was credential-gated because, at the time, the capability was.</w:t>
       </w:r>
     </w:p>
     <w:p>
@@ -406,7 +406,7 @@
         <w:pStyle w:val="BodyText"/>
       </w:pPr>
       <w:r>
-        <w:t xml:space="preserve">The collapse of the credential-to-capability link creates a civil rights gap. Effective participation in legal proceedings requires preparation, and preparation under threat of compelled disclosure is not meaningful preparation. If a person researching their legal rights knows that every query, every analysis, every drafted strategy can be demanded by the opposing side (while the opposing side's lawyer prepares in the shelter of work-product protection), the playing field is structurally tilted. The tilt does not arise from differences in the quality of the work. It arises from the asymmetry of protection.</w:t>
+        <w:t xml:space="preserve">The collapse of the credential-to-capability link creates a civil rights gap. Effective participation in legal proceedings requires preparation, and preparation conducted under threat of compelled disclosure is not meaningful preparation. If a person researching their legal rights knows that every query, every analysis, every drafted strategy can be demanded by the opposing side — while the opposing side's lawyer prepares in the shelter of work-product protection — the playing field is tilted. Not by the quality of the work, but by the asymmetry of protection.</w:t>
       </w:r>
     </w:p>
     <w:p>
@@ -430,7 +430,7 @@
         <w:t xml:space="preserve"> </w:t>
       </w:r>
       <w:r>
-        <w:t xml:space="preserve">split makes this asymmetry concrete. The criminal defendant who used AI independently of counsel lost all protection. The pro se civil plaintiff who used the same kind of AI for the same kind of preparation retained protection. The decisive variable was not the nature of the work, the content of the prompts, or the quality of the output. It was the user's status relative to the attorney-client relationship.</w:t>
+        <w:t xml:space="preserve">split makes this asymmetry concrete. A criminal defendant who used AI independently of counsel lost all protection. A pro se civil plaintiff who used the same kind of AI for the same kind of preparation kept hers. What separated them was not the nature of the work, the content of the prompts, or the quality of the output. It was the user's status relative to the attorney-client relationship.</w:t>
       </w:r>
       <w:r>
         <w:rPr>
@@ -442,7 +442,7 @@
         <w:t xml:space="preserve"> </w:t>
       </w:r>
       <w:r>
-        <w:t xml:space="preserve">For represented parties acting outside that relationship, AI-assisted work is exposed. For self-represented parties, AI-assisted work may be sheltered. For crime victims, who are not parties, not represented by the prosecutor, and not self-represented litigants, no framework attaches at all.</w:t>
+        <w:t xml:space="preserve">Represented parties acting outside that relationship are exposed. Self-represented parties may be sheltered. Crime victims — who are not parties, not represented by the prosecutor, and not self-represented litigants — fall outside the framework entirely.</w:t>
       </w:r>
       <w:r>
         <w:rPr>
@@ -456,7 +456,7 @@
         <w:pStyle w:val="BodyText"/>
       </w:pPr>
       <w:r>
-        <w:t xml:space="preserve">The doctrinal distinction between these categories has a functional consequence: people who cannot afford counsel or who fall through the cracks of the existing protection categories are the people most likely to rely on AI for legal preparation, and their preparation is the least protected. AI has expanded access to legal capability without expanding access to protected legal preparation. The capability is distributed; the protection is not.</w:t>
+        <w:t xml:space="preserve">The doctrinal distinction has a functional consequence. The people most likely to rely on AI for legal preparation are the same people least likely to have its results protected: those who cannot afford counsel, or who fall outside the recognized protection categories. AI has expanded what a non-lawyer can do. It has not expanded what a non-lawyer can do in confidence. The capability is distributed; the shelter is not.</w:t>
       </w:r>
     </w:p>
     <w:p>
@@ -481,7 +481,7 @@
         <w:pStyle w:val="FirstParagraph"/>
       </w:pPr>
       <w:r>
-        <w:t xml:space="preserve">The fracture is compounded by the technological and contractual architecture through which AI-assisted legal preparation is now delivered. The infrastructure matters because it is the mechanism through which protection is distributed.</w:t>
+        <w:t xml:space="preserve">The fracture is compounded by the technological and contractual architecture through which AI-assisted legal work is now delivered. That infrastructure is where protection actually gets allocated.</w:t>
       </w:r>
     </w:p>
     <w:bookmarkStart w:id="45" w:name="a-the-wrapper-ecosystem"/>
@@ -589,7 +589,7 @@
         <w:pStyle w:val="BodyText"/>
       </w:pPr>
       <w:r>
-        <w:t xml:space="preserve">As a result, the distinction between protected and unprotected AI-assisted legal preparation appears, in practice and as emerging cases suggest, to track access tier and user status rather than demonstrable differences in underlying analytical capability. This is not a technology distinction dressed in legal clothing. It is a credentialing product that signals:</w:t>
+        <w:t xml:space="preserve">In practice, then, and as emerging cases suggest, the line between protected and unprotected AI-assisted legal preparation tracks access tier and user status rather than any demonstrable difference in underlying analytical capability. The distinction is not technological dressed in legal clothing; it is a credentialing product. The signal it sends is:</w:t>
       </w:r>
       <w:r>
         <w:t xml:space="preserve"> </w:t>
@@ -605,7 +605,7 @@
         <w:t xml:space="preserve"> </w:t>
       </w:r>
       <w:r>
-        <w:t xml:space="preserve">The same model, accessed through the consumer platform by a non-attorney, produces output that is not protected, not because the work is different, but because the access tier identifies the user as a non-attorney.</w:t>
+        <w:t xml:space="preserve">The same model, accessed by a non-attorney through the consumer platform, produces output that is not protected — not because the work is different, but because the access tier identifies the user as a non-attorney.</w:t>
       </w:r>
     </w:p>
     <w:bookmarkEnd w:id="45"/>
@@ -635,7 +635,7 @@
         <w:t xml:space="preserve"> </w:t>
       </w:r>
       <w:r>
-        <w:t xml:space="preserve">The answer, in this context, is that they redistribute who gets protected legal thought.</w:t>
+        <w:t xml:space="preserve">The answer, here, is that they redistribute who gets to think legally in private.</w:t>
       </w:r>
     </w:p>
     <w:p>
@@ -651,7 +651,7 @@
         <w:pStyle w:val="BodyText"/>
       </w:pPr>
       <w:r>
-        <w:t xml:space="preserve">When courts, privilege doctrine, and procedural rules ratify an arrangement in which protected legal reasoning is functionally available only through licensed intermediaries and their enterprise tools, the inequality is state-backed. Private contracts are the mechanism of the inequality, not a defense to it. When the state, through its courts and procedural rules, ratifies a system in which the protection of legal preparation is distributed by private contract rather than by public entitlement, it conditions the exercise of constitutional rights on market access. That is, at its core, a civil rights problem.</w:t>
+        <w:t xml:space="preserve">When courts, privilege doctrine, and procedural rules ratify an arrangement in which protected legal reasoning is functionally available only through licensed intermediaries and their enterprise tools, the inequality is state-backed. Private contracts are the mechanism of the inequality, not a defense to it. A system in which the protection of legal preparation is distributed by private contract rather than by public entitlement conditions the exercise of constitutional rights on market access. That is, at its core, a civil rights problem.</w:t>
       </w:r>
     </w:p>
     <w:p>
@@ -677,7 +677,7 @@
         <w:pStyle w:val="FirstParagraph"/>
       </w:pPr>
       <w:r>
-        <w:t xml:space="preserve">Not every procedural asymmetry rises to the level of a civil rights concern. The fracture described here does, because the protection at issue (the ability to prepare in confidence) is a precondition to the exercise of rights the Constitution already guarantees. The AI work-product fracture implicates three foundational civil rights principles: equal protection, procedural fairness, and access to courts.</w:t>
+        <w:t xml:space="preserve">Not every procedural asymmetry rises to the level of a civil rights concern. The fracture described here does, because the protection at issue (the ability to prepare in confidence) is a precondition to the exercise of rights the Constitution already guarantees. The AI work-product fracture implicates three foundational principles at once — equal treatment, fair procedure, and meaningful access to the courts.</w:t>
       </w:r>
     </w:p>
     <w:bookmarkStart w:id="53" w:name="X350142c6bff366907adb7f34041dd67cc85f17c"/>
@@ -694,7 +694,7 @@
         <w:pStyle w:val="FirstParagraph"/>
       </w:pPr>
       <w:r>
-        <w:t xml:space="preserve">Two persons preparing for litigation (one a lawyer through Harvey, the other a self-represented litigant through consumer AI) may produce materially comparable legal analysis. The lawyer's work is protected. The self-represented litigant's work, under</w:t>
+        <w:t xml:space="preserve">Two people prepare for litigation. One is a lawyer working through Harvey; the other is a self-represented litigant working through consumer AI. They produce materially comparable legal analysis. The lawyer's work is protected. The self-represented litigant's, under</w:t>
       </w:r>
       <w:r>
         <w:t xml:space="preserve"> </w:t>
@@ -707,7 +707,7 @@
         <w:t xml:space="preserve">Heppner</w:t>
       </w:r>
       <w:r>
-        <w:t xml:space="preserve">'s logic, may not be. The distinction does not rest on the function the work serves or the care with which it was prepared. It rests on the professional status of the person who prepared it and the platform tier through which it was produced.</w:t>
+        <w:t xml:space="preserve">'s logic, may not be. What separates them is not the function the work serves or the care with which it was prepared, but the professional status of the person who prepared it and the platform tier through which it was produced.</w:t>
       </w:r>
     </w:p>
     <w:p>
@@ -743,7 +743,7 @@
         <w:t xml:space="preserve"> </w:t>
       </w:r>
       <w:r>
-        <w:t xml:space="preserve">The historical justification for credential-based asymmetry, that lawyers had unique analytical capacity, collapses when the same AI model generates materially comparable analysis for both. When function detaches from credential, a doctrine that ties protection to credential tracks status, not function. That classification, when it burdens the population least able to afford the alternative, is one that civil rights law has reason to scrutinize.</w:t>
+        <w:t xml:space="preserve">The historical justification for credential-based asymmetry, that lawyers had unique analytical capacity, collapses when the same AI model generates materially comparable analysis for both. When function detaches from credential, a doctrine that ties protection to credential tracks status, not function. A classification that burdens the population least able to afford the alternative is exactly the kind that civil rights scrutiny exists to examine.</w:t>
       </w:r>
     </w:p>
     <w:p>
@@ -751,7 +751,7 @@
         <w:pStyle w:val="BodyText"/>
       </w:pPr>
       <w:r>
-        <w:t xml:space="preserve">Work-product protection is not merely a procedural convenience. It is a precondition to the exercise of legal rights. A person who cannot research, analyze, and strategize in confidence cannot meaningfully prepare a defense, prosecute a claim, or navigate an administrative proceeding. In this sense, work-product protection stands in the same structural relationship to adversarial legal participation that access to transcripts stands to the right of appeal in</w:t>
+        <w:t xml:space="preserve">Work-product protection is not merely a procedural convenience. It is a precondition to the exercise of legal rights. A person who cannot research, analyze, and strategize in confidence cannot meaningfully prepare a defense, prosecute a claim, or navigate an administrative proceeding. In that sense, work-product protection stands to adversarial participation as access to transcripts stood to the right of appeal in</w:t>
       </w:r>
       <w:r>
         <w:t xml:space="preserve"> </w:t>
@@ -764,7 +764,7 @@
         <w:t xml:space="preserve">Griffin v. Illinois</w:t>
       </w:r>
       <w:r>
-        <w:t xml:space="preserve">, that access to counsel stands to the right of defense in</w:t>
+        <w:t xml:space="preserve">, as access to counsel stood to the right of defense in</w:t>
       </w:r>
       <w:r>
         <w:t xml:space="preserve"> </w:t>
@@ -777,7 +777,7 @@
         <w:t xml:space="preserve">Gideon v. Wainwright</w:t>
       </w:r>
       <w:r>
-        <w:t xml:space="preserve">, and that the right of self-representation stands to the right to present one's own case in</w:t>
+        <w:t xml:space="preserve">, and as the right of self-representation stood to the right to present one's own case in</w:t>
       </w:r>
       <w:r>
         <w:t xml:space="preserve"> </w:t>
@@ -790,7 +790,20 @@
         <w:t xml:space="preserve">Faretta v. California</w:t>
       </w:r>
       <w:r>
-        <w:t xml:space="preserve">. Each of those doctrines recognizes that the right itself is hollow without the conditions that make its exercise possible. A doctrine that conditions the ability to prepare, to think legally in private, is functionally part of the right itself, not an adjunct to it. Griffin's principle, that "there can be no equal justice where the kind of trial a man gets depends on the amount of money he has", applies directly when what determines that access is subscription tier rather than financial means per se. The inequality is the same. Only the mechanism has changed.</w:t>
+        <w:t xml:space="preserve">. Each of those doctrines recognizes that a right is hollow without the conditions that make its exercise possible. The ability to prepare — to think legally in private — is one of those conditions, not an adjunct to them.</w:t>
+      </w:r>
+      <w:r>
+        <w:t xml:space="preserve"> </w:t>
+      </w:r>
+      <w:r>
+        <w:rPr>
+          <w:i/>
+          <w:iCs/>
+        </w:rPr>
+        <w:t xml:space="preserve">Griffin</w:t>
+      </w:r>
+      <w:r>
+        <w:t xml:space="preserve">'s principle, that "there can be no equal justice where the kind of trial a man gets depends on the amount of money he has," applies directly when what determines access is subscription tier rather than financial means per se. The inequality is the same; only the mechanism has changed.</w:t>
       </w:r>
       <w:r>
         <w:rPr>
@@ -907,7 +920,7 @@
         <w:t xml:space="preserve"> </w:t>
       </w:r>
       <w:r>
-        <w:t xml:space="preserve">all require the ability to prepare. If the protection regime penalizes use of the only affordable preparation tool, access to courts is effectively conditioned on the ability to afford enterprise-tier legal infrastructure or to retain counsel.</w:t>
+        <w:t xml:space="preserve">each rest on prior, private preparation. If the protection regime penalizes use of the only affordable preparation tool, access to courts is effectively conditioned on the ability to afford enterprise-tier legal infrastructure or to retain counsel.</w:t>
       </w:r>
     </w:p>
     <w:p>
@@ -927,7 +940,7 @@
         <w:t xml:space="preserve"> </w:t>
       </w:r>
       <w:r>
-        <w:t xml:space="preserve">pro se civil litigants in housing, employment, and benefits cases; administrative claimants navigating immigration, Social Security disability, and licensing proceedings; and crime victims who are not parties to the criminal case, not represented by the prosecutor, and not entitled to appointed counsel.</w:t>
+        <w:t xml:space="preserve">pro se civil litigants in housing, employment, and benefits cases; administrative claimants navigating immigration, Social Security disability, and licensing proceedings; and crime victims, whose preparation falls in a gap the existing categories never anticipated.</w:t>
       </w:r>
       <w:r>
         <w:rPr>
@@ -939,7 +952,7 @@
         <w:t xml:space="preserve"> </w:t>
       </w:r>
       <w:r>
-        <w:t xml:space="preserve">The victim gap is not an oversight but a structural inevitability: because victims are not parties, the prosecutor represents the state rather than them, and the Sixth Amendment right to counsel does not attach, no existing framework reaches their preparation at all. For each of these populations, AI is the primary tool for legal preparation. For each, the protection of that preparation is either absent or ambiguous under current doctrine.</w:t>
+        <w:t xml:space="preserve">That gap is structural rather than accidental: victims are not parties, the prosecutor represents the state rather than them, and the Sixth Amendment right to counsel does not attach, so no doctrinal home exists for the work they do to engage with the proceeding. For each of these populations, AI is the primary tool for legal preparation. For each, the protection of that preparation is either absent or ambiguous under current doctrine.</w:t>
       </w:r>
     </w:p>
     <w:p>
@@ -993,7 +1006,7 @@
         <w:pStyle w:val="BodyText"/>
       </w:pPr>
       <w:r>
-        <w:t xml:space="preserve">The proposed rule is functional. Work-product protection should attach to the nature of legal preparation in anticipation of litigation or legal proceedings, not to the professional identity of the preparer or the technological channel through which the work is produced. AI-assisted material retains protection when prepared in anticipation of proceedings, unless the proponent demonstrates actual adversarially relevant exposure beyond ordinary computational processing.</w:t>
+        <w:t xml:space="preserve">The proposed rule is functional. Work-product protection should attach to the nature of the preparation done in anticipation of litigation or legal proceedings, not to the professional identity of the preparer or the technological channel through which the work is produced. AI-assisted material keeps that protection unless the proponent shows actual adversarially relevant exposure beyond ordinary computational processing.</w:t>
       </w:r>
       <w:r>
         <w:rPr>
@@ -1068,7 +1081,7 @@
         <w:t xml:space="preserve"> </w:t>
       </w:r>
       <w:r>
-        <w:t xml:space="preserve">The objection is misplaced. The functional rule does not protect AI output as algorithmic product; it protects the human preparation activity (the prompts, the directional choices, the integration of output into a litigation strategy) that embeds the preparer's mental impressions as surely as a paralegal's research memorandum does. The copyright analogy under</w:t>
+        <w:t xml:space="preserve">That objection is misplaced. The functional rule does not shelter AI output as algorithmic product; it shelters the human preparation activity — the prompts, the directional choices, the integration of output into a litigation strategy — that embeds the preparer's mental impressions as surely as a paralegal's research memorandum does. A copyright analogy under</w:t>
       </w:r>
       <w:r>
         <w:t xml:space="preserve"> </w:t>
@@ -1084,7 +1097,7 @@
         <w:t xml:space="preserve"> </w:t>
       </w:r>
       <w:r>
-        <w:t xml:space="preserve">is distinguishable on this same ground: copyright requires a human author whose creative expression resides in the work, while work product requires a human preparer whose strategic preparation is reflected in the materials. The AI is the substrate; the legal actor remains the human.</w:t>
+        <w:t xml:space="preserve">falls on the same line. Copyright requires a human author whose creative expression resides in the work; work product requires a human preparer whose strategic preparation is reflected in the materials. The AI is the substrate; the legal actor remains the human.</w:t>
       </w:r>
     </w:p>
     <w:p>
@@ -1232,7 +1245,7 @@
         <w:pStyle w:val="BodyText"/>
       </w:pPr>
       <w:r>
-        <w:t xml:space="preserve">Each path is a civil rights intervention. Each recognizes that the protection of legal preparation is not a professional courtesy but a prerequisite to the equal exercise of legal rights.</w:t>
+        <w:t xml:space="preserve">Each path is a civil rights intervention. Each recognizes that the ability to prepare in confidence is not a professional courtesy but a prerequisite to the equal exercise of legal rights.</w:t>
       </w:r>
     </w:p>
     <w:p>
@@ -1311,7 +1324,7 @@
         <w:t xml:space="preserve"> </w:t>
       </w:r>
       <w:r>
-        <w:t xml:space="preserve">They do not require opening proprietary models or revealing trade secrets. They certify the result, not the internals. They allow courts, agencies, and parties to ask the question that</w:t>
+        <w:t xml:space="preserve">The architecture does not require opening proprietary models or revealing trade secrets; it certifies the result, not the internals. What it makes possible is the question</w:t>
       </w:r>
       <w:r>
         <w:t xml:space="preserve"> </w:t>
@@ -1343,7 +1356,7 @@
         <w:t xml:space="preserve"> </w:t>
       </w:r>
       <w:r>
-        <w:t xml:space="preserve">each approached obliquely: did the protection survive the pipeline?</w:t>
+        <w:t xml:space="preserve">each approached obliquely but neither could quite ask: did the protection survive the pipeline?</w:t>
       </w:r>
     </w:p>
     <w:p>
@@ -1351,7 +1364,7 @@
         <w:pStyle w:val="BodyText"/>
       </w:pPr>
       <w:r>
-        <w:t xml:space="preserve">This Essay does not ask courts to adopt any particular technical architecture. It argues only that verifiable preservation of confidentiality and legal meaning is becoming possible, and that the functional rule proposed here is designed to take advantage of that possibility as it matures.</w:t>
+        <w:t xml:space="preserve">Nothing in the proposed rule asks courts to adopt any particular technical architecture. The point is narrower: verifiable preservation of confidentiality and legal meaning is becoming possible, and the functional rule is designed to take advantage of that possibility as it matures.</w:t>
       </w:r>
     </w:p>
     <w:p>
@@ -1376,7 +1389,7 @@
         <w:pStyle w:val="FirstParagraph"/>
       </w:pPr>
       <w:r>
-        <w:t xml:space="preserve">The civil rights project has always been about identifying the ways law formally grants equality while practically permitting inequality to persist through structural arrangements. The AI work-product fracture is one of those arrangements. Courts have not consciously decided to create a two-tier system of protected legal thought. They have done so inadvertently, by applying a doctrine designed for the pre-AI world to a world in which the factual predicate of that doctrine, that legal analytical capability tracks professional credential, has collapsed.</w:t>
+        <w:t xml:space="preserve">Civil rights doctrine has always concerned itself with the ways law formally grants equality while practically permitting inequality to persist through structural arrangements. The AI work-product fracture is one of those arrangements. Courts have not consciously decided to create a two-tier system of protected legal thought. They have done so inadvertently, by applying a doctrine designed for the pre-AI world to a world in which its factual predicate — that legal analytical capability tracks professional credential — has collapsed.</w:t>
       </w:r>
     </w:p>
     <w:p>
@@ -1392,7 +1405,7 @@
         <w:pStyle w:val="BodyText"/>
       </w:pPr>
       <w:r>
-        <w:t xml:space="preserve">Artificial intelligence is reshaping how individuals prepare to assert and defend their rights. Civil rights law is at an inflection point, courts are narrowing antidiscrimination doctrine, rethinking protected classes, and grappling with technologically mediated harm in every domain. The work-product fracture belongs in that conversation. As AI becomes the primary tool through which unrepresented individuals access the legal system, civil rights law must confront a new question: not only who is protected, but whose legal thought is allowed to remain protected at all.</w:t>
+        <w:t xml:space="preserve">Artificial intelligence is reshaping how individuals prepare to assert and defend their rights. Civil rights law sits at an inflection point: courts are narrowing antidiscrimination doctrine, rethinking protected classes, and grappling with technologically mediated harm in every domain. The work-product fracture belongs in that conversation. As AI becomes the primary tool through which unrepresented individuals reach the legal system, civil rights law must answer a new question — not only who is protected, but whose legal thought is allowed to remain protected at all.</w:t>
       </w:r>
     </w:p>
     <w:p>

</xml_diff>